<commit_message>
Day 3: deepen Materi to the plan's Wissen (rule 2.17) with real findings and a line-length example
All 12 Wissen bullets are now full: colour effects and their limits, WCAG 1.4.1, 1.4.4,
1.4.8, 1.4.11 and 1.4.12, type size and line length findings, Apple's text styles, the
Google 41-blues case, WHO vision figures, hierarchy and scanning, behaviour and trust.
New working example: delivery terms at three line lengths. Minutes rebalanced to 60;
Day 3 added to verify:depth. Word documents of Day 3 rebuilt.

Co-Authored-By: Claude Sonnet 5.5 <noreply@anthropic.com>
</commit_message>
<xml_diff>
--- a/docx/Day3-Materi-AION-UX-Developer-Colour-typography-and-readability.docx
+++ b/docx/Day3-Materi-AION-UX-Developer-Colour-typography-and-readability.docx
@@ -631,7 +631,7 @@
               <w:rPr>
                 <w:sz w:val="20"/>
               </w:rPr>
-              <w:t>A3 · Readable type: size, line spacing, contrast, weight and structure · 12 min · Core</w:t>
+              <w:t>A3 · Readable type: size, line spacing, contrast, weight and structure · 13 min · Core</w:t>
             </w:r>
           </w:p>
           <w:p>
@@ -655,7 +655,7 @@
               <w:rPr>
                 <w:sz w:val="20"/>
               </w:rPr>
-              <w:t>A5 · From colour and type to behaviour, and weighing a measure · 12 min · Core</w:t>
+              <w:t>A5 · From colour and type to behaviour, and weighing a measure · 11 min · Core</w:t>
             </w:r>
           </w:p>
           <w:p>
@@ -2398,7 +2398,7 @@
             </w:r>
             <w:r>
               <w:rPr/>
-              <w:t xml:space="preserve"> One Kettle &amp; Co order page with three switches for colour: an accent for the main action, red only for a real problem, and one colour per area.</w:t>
+              <w:t xml:space="preserve"> One Kettle &amp; Co order page with three switches for colour: an accent for the main action, red only for a real problem, and one colour per area. A table of what colour does, with evidence, follows.</w:t>
             </w:r>
           </w:p>
         </w:tc>
@@ -2830,6 +2830,372 @@
         <w:spacing w:before="0" w:after="80"/>
       </w:pPr>
     </w:p>
+    <w:p>
+      <w:pPr>
+        <w:spacing w:before="0" w:after="100"/>
+      </w:pPr>
+      <w:r>
+        <w:rPr>
+          <w:b/>
+        </w:rPr>
+        <w:t>What colour does, with evidence</w:t>
+      </w:r>
+    </w:p>
+    <w:tbl>
+      <w:tblPr>
+        <w:tblW w:w="9638" w:type="dxa"/>
+        <w:tblBorders>
+          <w:top w:val="single" w:sz="4" w:space="0" w:color="D5DEE9"/>
+          <w:left w:val="single" w:sz="4" w:space="0" w:color="D5DEE9"/>
+          <w:bottom w:val="single" w:sz="4" w:space="0" w:color="D5DEE9"/>
+          <w:right w:val="single" w:sz="4" w:space="0" w:color="D5DEE9"/>
+          <w:insideH w:val="single" w:sz="4" w:space="0" w:color="D5DEE9"/>
+          <w:insideV w:val="single" w:sz="4" w:space="0" w:color="D5DEE9"/>
+        </w:tblBorders>
+        <w:tblLayout w:type="fixed"/>
+        <w:tblCellMar>
+          <w:top w:w="60" w:type="dxa"/>
+          <w:left w:w="100" w:type="dxa"/>
+          <w:bottom w:w="60" w:type="dxa"/>
+          <w:right w:w="100" w:type="dxa"/>
+        </w:tblCellMar>
+      </w:tblPr>
+      <w:tblGrid>
+        <w:gridCol w:w="1650"/>
+        <w:gridCol w:w="4858"/>
+        <w:gridCol w:w="3130"/>
+      </w:tblGrid>
+      <w:tr>
+        <w:trPr>
+          <w:cantSplit/>
+          <w:tblHeader/>
+        </w:trPr>
+        <w:tc>
+          <w:tcPr>
+            <w:tcW w:type="dxa" w:w="1650"/>
+            <w:shd w:val="clear" w:color="auto" w:fill="E6ECF4"/>
+          </w:tcPr>
+          <w:p>
+            <w:pPr>
+              <w:spacing w:before="0" w:after="0"/>
+            </w:pPr>
+            <w:r>
+              <w:rPr>
+                <w:b/>
+                <w:sz w:val="20"/>
+              </w:rPr>
+              <w:t>Effect</w:t>
+            </w:r>
+          </w:p>
+        </w:tc>
+        <w:tc>
+          <w:tcPr>
+            <w:tcW w:type="dxa" w:w="4858"/>
+            <w:shd w:val="clear" w:color="auto" w:fill="E6ECF4"/>
+          </w:tcPr>
+          <w:p>
+            <w:pPr>
+              <w:spacing w:before="0" w:after="0"/>
+            </w:pPr>
+            <w:r>
+              <w:rPr>
+                <w:b/>
+                <w:sz w:val="20"/>
+              </w:rPr>
+              <w:t>Real finding</w:t>
+            </w:r>
+          </w:p>
+        </w:tc>
+        <w:tc>
+          <w:tcPr>
+            <w:tcW w:type="dxa" w:w="3130"/>
+            <w:shd w:val="clear" w:color="auto" w:fill="E6ECF4"/>
+          </w:tcPr>
+          <w:p>
+            <w:pPr>
+              <w:spacing w:before="0" w:after="0"/>
+            </w:pPr>
+            <w:r>
+              <w:rPr>
+                <w:b/>
+                <w:sz w:val="20"/>
+              </w:rPr>
+              <w:t>What it means for a screen</w:t>
+            </w:r>
+          </w:p>
+        </w:tc>
+      </w:tr>
+      <w:tr>
+        <w:trPr>
+          <w:cantSplit/>
+        </w:trPr>
+        <w:tc>
+          <w:tcPr>
+            <w:tcW w:type="dxa" w:w="1650"/>
+          </w:tcPr>
+          <w:p>
+            <w:pPr>
+              <w:spacing w:before="0" w:after="0"/>
+            </w:pPr>
+            <w:r>
+              <w:rPr>
+                <w:sz w:val="20"/>
+              </w:rPr>
+              <w:t>Attention</w:t>
+            </w:r>
+          </w:p>
+        </w:tc>
+        <w:tc>
+          <w:tcPr>
+            <w:tcW w:type="dxa" w:w="4858"/>
+          </w:tcPr>
+          <w:p>
+            <w:pPr>
+              <w:spacing w:before="0" w:after="0"/>
+            </w:pPr>
+            <w:r>
+              <w:rPr>
+                <w:sz w:val="20"/>
+              </w:rPr>
+              <w:t>Attention goes first to what differs most from its surroundings in colour and contrast (Itti and Koch 2001; Ware 2012).</w:t>
+            </w:r>
+          </w:p>
+        </w:tc>
+        <w:tc>
+          <w:tcPr>
+            <w:tcW w:type="dxa" w:w="3130"/>
+          </w:tcPr>
+          <w:p>
+            <w:pPr>
+              <w:spacing w:before="0" w:after="0"/>
+            </w:pPr>
+            <w:r>
+              <w:rPr>
+                <w:sz w:val="20"/>
+              </w:rPr>
+              <w:t>Give one element the strongest colour difference; a second accent splits the attention.</w:t>
+            </w:r>
+          </w:p>
+        </w:tc>
+      </w:tr>
+      <w:tr>
+        <w:trPr>
+          <w:cantSplit/>
+        </w:trPr>
+        <w:tc>
+          <w:tcPr>
+            <w:tcW w:type="dxa" w:w="1650"/>
+          </w:tcPr>
+          <w:p>
+            <w:pPr>
+              <w:spacing w:before="0" w:after="0"/>
+            </w:pPr>
+            <w:r>
+              <w:rPr>
+                <w:sz w:val="20"/>
+              </w:rPr>
+              <w:t>Activation and thinking</w:t>
+            </w:r>
+          </w:p>
+        </w:tc>
+        <w:tc>
+          <w:tcPr>
+            <w:tcW w:type="dxa" w:w="4858"/>
+          </w:tcPr>
+          <w:p>
+            <w:pPr>
+              <w:spacing w:before="0" w:after="0"/>
+            </w:pPr>
+            <w:r>
+              <w:rPr>
+                <w:sz w:val="20"/>
+              </w:rPr>
+              <w:t>In six tasks with more than 600 participants, red went with better performance on detail-oriented tasks and blue with better performance on creative tasks; the authors link red with avoidance and blue with approach (Mehta and Zhu 2009).</w:t>
+            </w:r>
+          </w:p>
+        </w:tc>
+        <w:tc>
+          <w:tcPr>
+            <w:tcW w:type="dxa" w:w="3130"/>
+          </w:tcPr>
+          <w:p>
+            <w:pPr>
+              <w:spacing w:before="0" w:after="0"/>
+            </w:pPr>
+            <w:r>
+              <w:rPr>
+                <w:sz w:val="20"/>
+              </w:rPr>
+              <w:t>Colour can change how a task is approached, but the effect depends on the task and the group: test it, do not assume it.</w:t>
+            </w:r>
+          </w:p>
+        </w:tc>
+      </w:tr>
+      <w:tr>
+        <w:trPr>
+          <w:cantSplit/>
+        </w:trPr>
+        <w:tc>
+          <w:tcPr>
+            <w:tcW w:type="dxa" w:w="1650"/>
+          </w:tcPr>
+          <w:p>
+            <w:pPr>
+              <w:spacing w:before="0" w:after="0"/>
+            </w:pPr>
+            <w:r>
+              <w:rPr>
+                <w:sz w:val="20"/>
+              </w:rPr>
+              <w:t>Trust and brand</w:t>
+            </w:r>
+          </w:p>
+        </w:tc>
+        <w:tc>
+          <w:tcPr>
+            <w:tcW w:type="dxa" w:w="4858"/>
+          </w:tcPr>
+          <w:p>
+            <w:pPr>
+              <w:spacing w:before="0" w:after="0"/>
+            </w:pPr>
+            <w:r>
+              <w:rPr>
+                <w:sz w:val="20"/>
+              </w:rPr>
+              <w:t>Colours shape how a brand is perceived, for example blue with competence and trust and red with excitement; the effect depends on the context (Labrecque and Milne 2012).</w:t>
+            </w:r>
+          </w:p>
+        </w:tc>
+        <w:tc>
+          <w:tcPr>
+            <w:tcW w:type="dxa" w:w="3130"/>
+          </w:tcPr>
+          <w:p>
+            <w:pPr>
+              <w:spacing w:before="0" w:after="0"/>
+            </w:pPr>
+            <w:r>
+              <w:rPr>
+                <w:sz w:val="20"/>
+              </w:rPr>
+              <w:t>Choose the colour of a service for the feeling it must give, and check it with the people it is for.</w:t>
+            </w:r>
+          </w:p>
+        </w:tc>
+      </w:tr>
+      <w:tr>
+        <w:trPr>
+          <w:cantSplit/>
+        </w:trPr>
+        <w:tc>
+          <w:tcPr>
+            <w:tcW w:type="dxa" w:w="1650"/>
+          </w:tcPr>
+          <w:p>
+            <w:pPr>
+              <w:spacing w:before="0" w:after="0"/>
+            </w:pPr>
+            <w:r>
+              <w:rPr>
+                <w:sz w:val="20"/>
+              </w:rPr>
+              <w:t>Warning</w:t>
+            </w:r>
+          </w:p>
+        </w:tc>
+        <w:tc>
+          <w:tcPr>
+            <w:tcW w:type="dxa" w:w="4858"/>
+          </w:tcPr>
+          <w:p>
+            <w:pPr>
+              <w:spacing w:before="0" w:after="0"/>
+            </w:pPr>
+            <w:r>
+              <w:rPr>
+                <w:sz w:val="20"/>
+              </w:rPr>
+              <w:t>Colour carries meaning learnt from context, such as red for danger (Elliot and Maier 2014). The claim that red lowers intellectual performance did not hold after a correction for publication bias (Gnambs 2020).</w:t>
+            </w:r>
+          </w:p>
+        </w:tc>
+        <w:tc>
+          <w:tcPr>
+            <w:tcW w:type="dxa" w:w="3130"/>
+          </w:tcPr>
+          <w:p>
+            <w:pPr>
+              <w:spacing w:before="0" w:after="0"/>
+            </w:pPr>
+            <w:r>
+              <w:rPr>
+                <w:sz w:val="20"/>
+              </w:rPr>
+              <w:t>Keep red for real problems because people learn it; do not rely on a claim that red changes what people can do.</w:t>
+            </w:r>
+          </w:p>
+        </w:tc>
+      </w:tr>
+      <w:tr>
+        <w:trPr>
+          <w:cantSplit/>
+        </w:trPr>
+        <w:tc>
+          <w:tcPr>
+            <w:tcW w:type="dxa" w:w="1650"/>
+          </w:tcPr>
+          <w:p>
+            <w:pPr>
+              <w:spacing w:before="0" w:after="0"/>
+            </w:pPr>
+            <w:r>
+              <w:rPr>
+                <w:sz w:val="20"/>
+              </w:rPr>
+              <w:t>Orientation</w:t>
+            </w:r>
+          </w:p>
+        </w:tc>
+        <w:tc>
+          <w:tcPr>
+            <w:tcW w:type="dxa" w:w="4858"/>
+          </w:tcPr>
+          <w:p>
+            <w:pPr>
+              <w:spacing w:before="0" w:after="0"/>
+            </w:pPr>
+            <w:r>
+              <w:rPr>
+                <w:sz w:val="20"/>
+              </w:rPr>
+              <w:t>In an eight-country study, colour meanings and preferences showed both similarities and differences across the countries (Madden et al. 2000).</w:t>
+            </w:r>
+          </w:p>
+        </w:tc>
+        <w:tc>
+          <w:tcPr>
+            <w:tcW w:type="dxa" w:w="3130"/>
+          </w:tcPr>
+          <w:p>
+            <w:pPr>
+              <w:spacing w:before="0" w:after="0"/>
+            </w:pPr>
+            <w:r>
+              <w:rPr>
+                <w:sz w:val="20"/>
+              </w:rPr>
+              <w:t>A colour code that works in one country or group has to be checked in the next.</w:t>
+            </w:r>
+          </w:p>
+        </w:tc>
+      </w:tr>
+    </w:tbl>
+    <w:p>
+      <w:pPr>
+        <w:spacing w:before="0" w:after="80"/>
+      </w:pPr>
+    </w:p>
     <w:tbl>
       <w:tblPr>
         <w:tblW w:w="9598" w:type="dxa"/>
@@ -2879,7 +3245,7 @@
             </w:pPr>
             <w:r>
               <w:rPr/>
-              <w:t>Kettle &amp; Co, Rosa, Theo, Ines and Karim are made up for this example. The effects of colour follow Elliot and Maier (2014); colour and brand perception follow Labrecque and Milne (2012); red as caution and blue as approach follow Mehta and Zhu (2009).</w:t>
+              <w:t>Kettle &amp; Co, Rosa, Theo, Ines and Karim are made up for this example. The effects of colour follow Elliot and Maier (2014); colour and brand perception follow Labrecque and Milne (2012); red as caution and blue as approach follow Mehta and Zhu (2009). The findings in the table of real evidence are real research results, rules and cases; the sources are listed below.</w:t>
             </w:r>
           </w:p>
         </w:tc>
@@ -3068,7 +3434,7 @@
           <w:color w:val="556274"/>
           <w:sz w:val="18"/>
         </w:rPr>
-        <w:t>Elliot &amp; Maier 2014 · Labrecque &amp; Milne 2012 · Mehta &amp; Zhu 2009 · Ware 2012</w:t>
+        <w:t>Elliot &amp; Maier 2014 · Labrecque &amp; Milne 2012 · Mehta &amp; Zhu 2009 · Ware 2012 · Itti &amp; Koch 2001 · Madden et al. 2000 · Gnambs 2020</w:t>
       </w:r>
     </w:p>
     <w:p>
@@ -3182,7 +3548,7 @@
             </w:r>
             <w:r>
               <w:rPr/>
-              <w:t xml:space="preserve"> The same Kettle &amp; Co order page twice: coloured to decorate and coloured to function.</w:t>
+              <w:t xml:space="preserve"> The same Kettle &amp; Co order page twice: coloured to decorate and coloured to function. A table of colour rules and a real case follows.</w:t>
             </w:r>
           </w:p>
         </w:tc>
@@ -3614,6 +3980,319 @@
         <w:spacing w:before="0" w:after="80"/>
       </w:pPr>
     </w:p>
+    <w:p>
+      <w:pPr>
+        <w:spacing w:before="0" w:after="100"/>
+      </w:pPr>
+      <w:r>
+        <w:rPr>
+          <w:b/>
+        </w:rPr>
+        <w:t>Colour for action, priority and state: rules and a real case</w:t>
+      </w:r>
+    </w:p>
+    <w:tbl>
+      <w:tblPr>
+        <w:tblW w:w="9638" w:type="dxa"/>
+        <w:tblBorders>
+          <w:top w:val="single" w:sz="4" w:space="0" w:color="D5DEE9"/>
+          <w:left w:val="single" w:sz="4" w:space="0" w:color="D5DEE9"/>
+          <w:bottom w:val="single" w:sz="4" w:space="0" w:color="D5DEE9"/>
+          <w:right w:val="single" w:sz="4" w:space="0" w:color="D5DEE9"/>
+          <w:insideH w:val="single" w:sz="4" w:space="0" w:color="D5DEE9"/>
+          <w:insideV w:val="single" w:sz="4" w:space="0" w:color="D5DEE9"/>
+        </w:tblBorders>
+        <w:tblLayout w:type="fixed"/>
+        <w:tblCellMar>
+          <w:top w:w="60" w:type="dxa"/>
+          <w:left w:w="100" w:type="dxa"/>
+          <w:bottom w:w="60" w:type="dxa"/>
+          <w:right w:w="100" w:type="dxa"/>
+        </w:tblCellMar>
+      </w:tblPr>
+      <w:tblGrid>
+        <w:gridCol w:w="1646"/>
+        <w:gridCol w:w="4574"/>
+        <w:gridCol w:w="3418"/>
+      </w:tblGrid>
+      <w:tr>
+        <w:trPr>
+          <w:cantSplit/>
+          <w:tblHeader/>
+        </w:trPr>
+        <w:tc>
+          <w:tcPr>
+            <w:tcW w:type="dxa" w:w="1646"/>
+            <w:shd w:val="clear" w:color="auto" w:fill="E6ECF4"/>
+          </w:tcPr>
+          <w:p>
+            <w:pPr>
+              <w:spacing w:before="0" w:after="0"/>
+            </w:pPr>
+            <w:r>
+              <w:rPr>
+                <w:b/>
+                <w:sz w:val="20"/>
+              </w:rPr>
+              <w:t>Topic</w:t>
+            </w:r>
+          </w:p>
+        </w:tc>
+        <w:tc>
+          <w:tcPr>
+            <w:tcW w:type="dxa" w:w="4574"/>
+            <w:shd w:val="clear" w:color="auto" w:fill="E6ECF4"/>
+          </w:tcPr>
+          <w:p>
+            <w:pPr>
+              <w:spacing w:before="0" w:after="0"/>
+            </w:pPr>
+            <w:r>
+              <w:rPr>
+                <w:b/>
+                <w:sz w:val="20"/>
+              </w:rPr>
+              <w:t>Real rule or case</w:t>
+            </w:r>
+          </w:p>
+        </w:tc>
+        <w:tc>
+          <w:tcPr>
+            <w:tcW w:type="dxa" w:w="3418"/>
+            <w:shd w:val="clear" w:color="auto" w:fill="E6ECF4"/>
+          </w:tcPr>
+          <w:p>
+            <w:pPr>
+              <w:spacing w:before="0" w:after="0"/>
+            </w:pPr>
+            <w:r>
+              <w:rPr>
+                <w:b/>
+                <w:sz w:val="20"/>
+              </w:rPr>
+              <w:t>What it means for a screen</w:t>
+            </w:r>
+          </w:p>
+        </w:tc>
+      </w:tr>
+      <w:tr>
+        <w:trPr>
+          <w:cantSplit/>
+        </w:trPr>
+        <w:tc>
+          <w:tcPr>
+            <w:tcW w:type="dxa" w:w="1646"/>
+          </w:tcPr>
+          <w:p>
+            <w:pPr>
+              <w:spacing w:before="0" w:after="0"/>
+            </w:pPr>
+            <w:r>
+              <w:rPr>
+                <w:sz w:val="20"/>
+              </w:rPr>
+              <w:t>State</w:t>
+            </w:r>
+          </w:p>
+        </w:tc>
+        <w:tc>
+          <w:tcPr>
+            <w:tcW w:type="dxa" w:w="4574"/>
+          </w:tcPr>
+          <w:p>
+            <w:pPr>
+              <w:spacing w:before="0" w:after="0"/>
+            </w:pPr>
+            <w:r>
+              <w:rPr>
+                <w:sz w:val="20"/>
+              </w:rPr>
+              <w:t>Colour must not be the only way to show information such as a state (WCAG 1.4.1); about 1 in 12 men and 1 in 200 women have a colour vision deficiency (Wong 2011).</w:t>
+            </w:r>
+          </w:p>
+        </w:tc>
+        <w:tc>
+          <w:tcPr>
+            <w:tcW w:type="dxa" w:w="3418"/>
+          </w:tcPr>
+          <w:p>
+            <w:pPr>
+              <w:spacing w:before="0" w:after="0"/>
+            </w:pPr>
+            <w:r>
+              <w:rPr>
+                <w:sz w:val="20"/>
+              </w:rPr>
+              <w:t>Put a word or an icon beside every state colour: “Delivered”, “On its way”, “Failed”.</w:t>
+            </w:r>
+          </w:p>
+        </w:tc>
+      </w:tr>
+      <w:tr>
+        <w:trPr>
+          <w:cantSplit/>
+        </w:trPr>
+        <w:tc>
+          <w:tcPr>
+            <w:tcW w:type="dxa" w:w="1646"/>
+          </w:tcPr>
+          <w:p>
+            <w:pPr>
+              <w:spacing w:before="0" w:after="0"/>
+            </w:pPr>
+            <w:r>
+              <w:rPr>
+                <w:sz w:val="20"/>
+              </w:rPr>
+              <w:t>Action and state controls</w:t>
+            </w:r>
+          </w:p>
+        </w:tc>
+        <w:tc>
+          <w:tcPr>
+            <w:tcW w:type="dxa" w:w="4574"/>
+          </w:tcPr>
+          <w:p>
+            <w:pPr>
+              <w:spacing w:before="0" w:after="0"/>
+            </w:pPr>
+            <w:r>
+              <w:rPr>
+                <w:sz w:val="20"/>
+              </w:rPr>
+              <w:t>The parts of controls and states that people need to identify them need a contrast ratio of at least 3 to 1 against their surroundings (WCAG 1.4.11).</w:t>
+            </w:r>
+          </w:p>
+        </w:tc>
+        <w:tc>
+          <w:tcPr>
+            <w:tcW w:type="dxa" w:w="3418"/>
+          </w:tcPr>
+          <w:p>
+            <w:pPr>
+              <w:spacing w:before="0" w:after="0"/>
+            </w:pPr>
+            <w:r>
+              <w:rPr>
+                <w:sz w:val="20"/>
+              </w:rPr>
+              <w:t>Check the border of a button and the mark of a selected state, not only the text.</w:t>
+            </w:r>
+          </w:p>
+        </w:tc>
+      </w:tr>
+      <w:tr>
+        <w:trPr>
+          <w:cantSplit/>
+        </w:trPr>
+        <w:tc>
+          <w:tcPr>
+            <w:tcW w:type="dxa" w:w="1646"/>
+          </w:tcPr>
+          <w:p>
+            <w:pPr>
+              <w:spacing w:before="0" w:after="0"/>
+            </w:pPr>
+            <w:r>
+              <w:rPr>
+                <w:sz w:val="20"/>
+              </w:rPr>
+              <w:t>Decorative or functional</w:t>
+            </w:r>
+          </w:p>
+        </w:tc>
+        <w:tc>
+          <w:tcPr>
+            <w:tcW w:type="dxa" w:w="4574"/>
+          </w:tcPr>
+          <w:p>
+            <w:pPr>
+              <w:spacing w:before="0" w:after="0"/>
+            </w:pPr>
+            <w:r>
+              <w:rPr>
+                <w:sz w:val="20"/>
+              </w:rPr>
+              <w:t>Google tested 41 shades of blue for its links in 2009, each shown to a small share of users; the designer Douglas Bowman left, saying he had “grown tired of debating such minuscule design decisions” (Bowman 2009).</w:t>
+            </w:r>
+          </w:p>
+        </w:tc>
+        <w:tc>
+          <w:tcPr>
+            <w:tcW w:type="dxa" w:w="3418"/>
+          </w:tcPr>
+          <w:p>
+            <w:pPr>
+              <w:spacing w:before="0" w:after="0"/>
+            </w:pPr>
+            <w:r>
+              <w:rPr>
+                <w:sz w:val="20"/>
+              </w:rPr>
+              <w:t>A colour that is chosen to work can be tested, but a test needs a goal, and a team needs a rule for when to stop testing.</w:t>
+            </w:r>
+          </w:p>
+        </w:tc>
+      </w:tr>
+      <w:tr>
+        <w:trPr>
+          <w:cantSplit/>
+        </w:trPr>
+        <w:tc>
+          <w:tcPr>
+            <w:tcW w:type="dxa" w:w="1646"/>
+          </w:tcPr>
+          <w:p>
+            <w:pPr>
+              <w:spacing w:before="0" w:after="0"/>
+            </w:pPr>
+            <w:r>
+              <w:rPr>
+                <w:sz w:val="20"/>
+              </w:rPr>
+              <w:t>Unplanned colour</w:t>
+            </w:r>
+          </w:p>
+        </w:tc>
+        <w:tc>
+          <w:tcPr>
+            <w:tcW w:type="dxa" w:w="4574"/>
+          </w:tcPr>
+          <w:p>
+            <w:pPr>
+              <w:spacing w:before="0" w:after="0"/>
+            </w:pPr>
+            <w:r>
+              <w:rPr>
+                <w:sz w:val="20"/>
+              </w:rPr>
+              <w:t>Attention goes to what differs most (Itti and Koch 2001); every extra strong colour is another candidate for the first glance.</w:t>
+            </w:r>
+          </w:p>
+        </w:tc>
+        <w:tc>
+          <w:tcPr>
+            <w:tcW w:type="dxa" w:w="3418"/>
+          </w:tcPr>
+          <w:p>
+            <w:pPr>
+              <w:spacing w:before="0" w:after="0"/>
+            </w:pPr>
+            <w:r>
+              <w:rPr>
+                <w:sz w:val="20"/>
+              </w:rPr>
+              <w:t>Count the strong colours on a screen: more than one accent, or colours with no rule, mean overload and no hierarchy.</w:t>
+            </w:r>
+          </w:p>
+        </w:tc>
+      </w:tr>
+    </w:tbl>
+    <w:p>
+      <w:pPr>
+        <w:spacing w:before="0" w:after="80"/>
+      </w:pPr>
+    </w:p>
     <w:tbl>
       <w:tblPr>
         <w:tblW w:w="9598" w:type="dxa"/>
@@ -3663,7 +4342,7 @@
             </w:pPr>
             <w:r>
               <w:rPr/>
-              <w:t>Kettle &amp; Co, Rosa, Theo, Ines and Karim are made up for this example. That colour must not be the only way to convey information is WCAG 2.2, criterion 1.4.1; consistency and standards is Nielsen's heuristic (1994).</w:t>
+              <w:t>Kettle &amp; Co, Rosa, Theo, Ines and Karim are made up for this example. That colour must not be the only way to convey information is WCAG 2.2, criterion 1.4.1; consistency and standards is Nielsen's heuristic (1994). The findings in the table of real evidence are real research results, rules and cases; the sources are listed below.</w:t>
             </w:r>
           </w:p>
         </w:tc>
@@ -3842,7 +4521,7 @@
           <w:color w:val="556274"/>
           <w:sz w:val="18"/>
         </w:rPr>
-        <w:t>WCAG 2.2 · Nielsen 1994 · Ware 2012</w:t>
+        <w:t>WCAG 2.2 · Nielsen 1994 · Ware 2012 · Wong 2011 · Bowman 2009 · Itti &amp; Koch 2001</w:t>
       </w:r>
     </w:p>
     <w:p>
@@ -3851,7 +4530,7 @@
       </w:pPr>
       <w:r>
         <w:rPr/>
-        <w:t>A3 · Readable type: size, line spacing, contrast, weight and structure · 12 min · Core</w:t>
+        <w:t>A3 · Readable type: size, line spacing, contrast, weight and structure · 13 min · Core</w:t>
       </w:r>
     </w:p>
     <w:p>
@@ -3956,7 +4635,7 @@
             </w:r>
             <w:r>
               <w:rPr/>
-              <w:t xml:space="preserve"> One Kettle &amp; Co delivery notice with four switches: larger type, more line spacing, more contrast and a clear structure.</w:t>
+              <w:t xml:space="preserve"> One Kettle &amp; Co delivery notice with four switches: larger type, more line spacing, more contrast and a clear structure. Then a second working example with line length, and a table of the numbers and rules for readable type.</w:t>
             </w:r>
           </w:p>
         </w:tc>
@@ -4388,6 +5067,372 @@
         <w:spacing w:before="0" w:after="80"/>
       </w:pPr>
     </w:p>
+    <w:p>
+      <w:pPr>
+        <w:spacing w:before="0" w:after="100"/>
+      </w:pPr>
+      <w:r>
+        <w:rPr>
+          <w:b/>
+        </w:rPr>
+        <w:t>Readable type: numbers and rules</w:t>
+      </w:r>
+    </w:p>
+    <w:tbl>
+      <w:tblPr>
+        <w:tblW w:w="9638" w:type="dxa"/>
+        <w:tblBorders>
+          <w:top w:val="single" w:sz="4" w:space="0" w:color="D5DEE9"/>
+          <w:left w:val="single" w:sz="4" w:space="0" w:color="D5DEE9"/>
+          <w:bottom w:val="single" w:sz="4" w:space="0" w:color="D5DEE9"/>
+          <w:right w:val="single" w:sz="4" w:space="0" w:color="D5DEE9"/>
+          <w:insideH w:val="single" w:sz="4" w:space="0" w:color="D5DEE9"/>
+          <w:insideV w:val="single" w:sz="4" w:space="0" w:color="D5DEE9"/>
+        </w:tblBorders>
+        <w:tblLayout w:type="fixed"/>
+        <w:tblCellMar>
+          <w:top w:w="60" w:type="dxa"/>
+          <w:left w:w="100" w:type="dxa"/>
+          <w:bottom w:w="60" w:type="dxa"/>
+          <w:right w:w="100" w:type="dxa"/>
+        </w:tblCellMar>
+      </w:tblPr>
+      <w:tblGrid>
+        <w:gridCol w:w="1349"/>
+        <w:gridCol w:w="5499"/>
+        <w:gridCol w:w="2790"/>
+      </w:tblGrid>
+      <w:tr>
+        <w:trPr>
+          <w:cantSplit/>
+          <w:tblHeader/>
+        </w:trPr>
+        <w:tc>
+          <w:tcPr>
+            <w:tcW w:type="dxa" w:w="1349"/>
+            <w:shd w:val="clear" w:color="auto" w:fill="E6ECF4"/>
+          </w:tcPr>
+          <w:p>
+            <w:pPr>
+              <w:spacing w:before="0" w:after="0"/>
+            </w:pPr>
+            <w:r>
+              <w:rPr>
+                <w:b/>
+                <w:sz w:val="20"/>
+              </w:rPr>
+              <w:t>Lever</w:t>
+            </w:r>
+          </w:p>
+        </w:tc>
+        <w:tc>
+          <w:tcPr>
+            <w:tcW w:type="dxa" w:w="5499"/>
+            <w:shd w:val="clear" w:color="auto" w:fill="E6ECF4"/>
+          </w:tcPr>
+          <w:p>
+            <w:pPr>
+              <w:spacing w:before="0" w:after="0"/>
+            </w:pPr>
+            <w:r>
+              <w:rPr>
+                <w:b/>
+                <w:sz w:val="20"/>
+              </w:rPr>
+              <w:t>Real rule or finding</w:t>
+            </w:r>
+          </w:p>
+        </w:tc>
+        <w:tc>
+          <w:tcPr>
+            <w:tcW w:type="dxa" w:w="2790"/>
+            <w:shd w:val="clear" w:color="auto" w:fill="E6ECF4"/>
+          </w:tcPr>
+          <w:p>
+            <w:pPr>
+              <w:spacing w:before="0" w:after="0"/>
+            </w:pPr>
+            <w:r>
+              <w:rPr>
+                <w:b/>
+                <w:sz w:val="20"/>
+              </w:rPr>
+              <w:t>What to check</w:t>
+            </w:r>
+          </w:p>
+        </w:tc>
+      </w:tr>
+      <w:tr>
+        <w:trPr>
+          <w:cantSplit/>
+        </w:trPr>
+        <w:tc>
+          <w:tcPr>
+            <w:tcW w:type="dxa" w:w="1349"/>
+          </w:tcPr>
+          <w:p>
+            <w:pPr>
+              <w:spacing w:before="0" w:after="0"/>
+            </w:pPr>
+            <w:r>
+              <w:rPr>
+                <w:sz w:val="20"/>
+              </w:rPr>
+              <w:t>Size</w:t>
+            </w:r>
+          </w:p>
+        </w:tc>
+        <w:tc>
+          <w:tcPr>
+            <w:tcW w:type="dxa" w:w="5499"/>
+          </w:tcPr>
+          <w:p>
+            <w:pPr>
+              <w:spacing w:before="0" w:after="0"/>
+            </w:pPr>
+            <w:r>
+              <w:rPr>
+                <w:sz w:val="20"/>
+              </w:rPr>
+              <w:t>Reading and comprehension on screen improved with larger type up to 18 points; 10 and 12 points gave the lowest comprehension (Rello et al. 2016). Apple's guidelines give iOS a default body size of 17 points and a minimum of 11 points. WCAG 1.4.4 requires that text can be enlarged to 200% without loss of content.</w:t>
+            </w:r>
+          </w:p>
+        </w:tc>
+        <w:tc>
+          <w:tcPr>
+            <w:tcW w:type="dxa" w:w="2790"/>
+          </w:tcPr>
+          <w:p>
+            <w:pPr>
+              <w:spacing w:before="0" w:after="0"/>
+            </w:pPr>
+            <w:r>
+              <w:rPr>
+                <w:sz w:val="20"/>
+              </w:rPr>
+              <w:t>Set the body text for the whole target group, and test the page at 200%.</w:t>
+            </w:r>
+          </w:p>
+        </w:tc>
+      </w:tr>
+      <w:tr>
+        <w:trPr>
+          <w:cantSplit/>
+        </w:trPr>
+        <w:tc>
+          <w:tcPr>
+            <w:tcW w:type="dxa" w:w="1349"/>
+          </w:tcPr>
+          <w:p>
+            <w:pPr>
+              <w:spacing w:before="0" w:after="0"/>
+            </w:pPr>
+            <w:r>
+              <w:rPr>
+                <w:sz w:val="20"/>
+              </w:rPr>
+              <w:t>Line spacing</w:t>
+            </w:r>
+          </w:p>
+        </w:tc>
+        <w:tc>
+          <w:tcPr>
+            <w:tcW w:type="dxa" w:w="5499"/>
+          </w:tcPr>
+          <w:p>
+            <w:pPr>
+              <w:spacing w:before="0" w:after="0"/>
+            </w:pPr>
+            <w:r>
+              <w:rPr>
+                <w:sz w:val="20"/>
+              </w:rPr>
+              <w:t>WCAG 1.4.12 requires that content still works when a user sets the line height to 1.5 times the font size, the space after paragraphs to 2 times, the letter spacing to 0.12 and the word spacing to 0.16 times the font size. In the study of Rello et al. (2016), tight line spacing lowered comprehension.</w:t>
+            </w:r>
+          </w:p>
+        </w:tc>
+        <w:tc>
+          <w:tcPr>
+            <w:tcW w:type="dxa" w:w="2790"/>
+          </w:tcPr>
+          <w:p>
+            <w:pPr>
+              <w:spacing w:before="0" w:after="0"/>
+            </w:pPr>
+            <w:r>
+              <w:rPr>
+                <w:sz w:val="20"/>
+              </w:rPr>
+              <w:t>Do not fix the height of boxes that hold text: they clip when users change the spacing.</w:t>
+            </w:r>
+          </w:p>
+        </w:tc>
+      </w:tr>
+      <w:tr>
+        <w:trPr>
+          <w:cantSplit/>
+        </w:trPr>
+        <w:tc>
+          <w:tcPr>
+            <w:tcW w:type="dxa" w:w="1349"/>
+          </w:tcPr>
+          <w:p>
+            <w:pPr>
+              <w:spacing w:before="0" w:after="0"/>
+            </w:pPr>
+            <w:r>
+              <w:rPr>
+                <w:sz w:val="20"/>
+              </w:rPr>
+              <w:t>Line length</w:t>
+            </w:r>
+          </w:p>
+        </w:tc>
+        <w:tc>
+          <w:tcPr>
+            <w:tcW w:type="dxa" w:w="5499"/>
+          </w:tcPr>
+          <w:p>
+            <w:pPr>
+              <w:spacing w:before="0" w:after="0"/>
+            </w:pPr>
+            <w:r>
+              <w:rPr>
+                <w:sz w:val="20"/>
+              </w:rPr>
+              <w:t>WCAG 1.4.8 (level AAA) asks for no more than 80 characters per line. In one study, comprehension was highest at about 55 characters per line (Dyson and Haselgrove 2001, as reported).</w:t>
+            </w:r>
+          </w:p>
+        </w:tc>
+        <w:tc>
+          <w:tcPr>
+            <w:tcW w:type="dxa" w:w="2790"/>
+          </w:tcPr>
+          <w:p>
+            <w:pPr>
+              <w:spacing w:before="0" w:after="0"/>
+            </w:pPr>
+            <w:r>
+              <w:rPr>
+                <w:sz w:val="20"/>
+              </w:rPr>
+              <w:t>Cap the width of a text column at about 50 to 80 characters.</w:t>
+            </w:r>
+          </w:p>
+        </w:tc>
+      </w:tr>
+      <w:tr>
+        <w:trPr>
+          <w:cantSplit/>
+        </w:trPr>
+        <w:tc>
+          <w:tcPr>
+            <w:tcW w:type="dxa" w:w="1349"/>
+          </w:tcPr>
+          <w:p>
+            <w:pPr>
+              <w:spacing w:before="0" w:after="0"/>
+            </w:pPr>
+            <w:r>
+              <w:rPr>
+                <w:sz w:val="20"/>
+              </w:rPr>
+              <w:t>Weight and typeface</w:t>
+            </w:r>
+          </w:p>
+        </w:tc>
+        <w:tc>
+          <w:tcPr>
+            <w:tcW w:type="dxa" w:w="5499"/>
+          </w:tcPr>
+          <w:p>
+            <w:pPr>
+              <w:spacing w:before="0" w:after="0"/>
+            </w:pPr>
+            <w:r>
+              <w:rPr>
+                <w:sz w:val="20"/>
+              </w:rPr>
+              <w:t>Thin and decorative letter shapes are harder to read at small sizes (Beier 2012).</w:t>
+            </w:r>
+          </w:p>
+        </w:tc>
+        <w:tc>
+          <w:tcPr>
+            <w:tcW w:type="dxa" w:w="2790"/>
+          </w:tcPr>
+          <w:p>
+            <w:pPr>
+              <w:spacing w:before="0" w:after="0"/>
+            </w:pPr>
+            <w:r>
+              <w:rPr>
+                <w:sz w:val="20"/>
+              </w:rPr>
+              <w:t>Use a regular weight for text and keep light or decorative styles for large headings.</w:t>
+            </w:r>
+          </w:p>
+        </w:tc>
+      </w:tr>
+      <w:tr>
+        <w:trPr>
+          <w:cantSplit/>
+        </w:trPr>
+        <w:tc>
+          <w:tcPr>
+            <w:tcW w:type="dxa" w:w="1349"/>
+          </w:tcPr>
+          <w:p>
+            <w:pPr>
+              <w:spacing w:before="0" w:after="0"/>
+            </w:pPr>
+            <w:r>
+              <w:rPr>
+                <w:sz w:val="20"/>
+              </w:rPr>
+              <w:t>Who it matters for</w:t>
+            </w:r>
+          </w:p>
+        </w:tc>
+        <w:tc>
+          <w:tcPr>
+            <w:tcW w:type="dxa" w:w="5499"/>
+          </w:tcPr>
+          <w:p>
+            <w:pPr>
+              <w:spacing w:before="0" w:after="0"/>
+            </w:pPr>
+            <w:r>
+              <w:rPr>
+                <w:sz w:val="20"/>
+              </w:rPr>
+              <w:t>At least 2.2 billion people have a vision impairment or blindness (World Health Organization 2019).</w:t>
+            </w:r>
+          </w:p>
+        </w:tc>
+        <w:tc>
+          <w:tcPr>
+            <w:tcW w:type="dxa" w:w="2790"/>
+          </w:tcPr>
+          <w:p>
+            <w:pPr>
+              <w:spacing w:before="0" w:after="0"/>
+            </w:pPr>
+            <w:r>
+              <w:rPr>
+                <w:sz w:val="20"/>
+              </w:rPr>
+              <w:t>Readable type is the normal case, not an edge case.</w:t>
+            </w:r>
+          </w:p>
+        </w:tc>
+      </w:tr>
+    </w:tbl>
+    <w:p>
+      <w:pPr>
+        <w:spacing w:before="0" w:after="80"/>
+      </w:pPr>
+    </w:p>
     <w:tbl>
       <w:tblPr>
         <w:tblW w:w="9598" w:type="dxa"/>
@@ -4437,7 +5482,7 @@
             </w:pPr>
             <w:r>
               <w:rPr/>
-              <w:t>Kettle &amp; Co, Rosa, Theo, Ines and Karim are made up for this example. The effect of type size and line spacing on screen reading follows Rello, Pielot and Marcos (2016); layout and line length follow Dyson (2004); legibility of letter shapes and weights follows Beier (2012); minimum text contrast is WCAG 2.2, criterion 1.4.3.</w:t>
+              <w:t>Kettle &amp; Co, Rosa, Theo, Ines and Karim are made up for this example. The effect of type size and line spacing on screen reading follows Rello, Pielot and Marcos (2016); layout and line length follow Dyson (2004); legibility of letter shapes and weights follows Beier (2012); minimum text contrast is WCAG 2.2, criterion 1.4.3. The findings in the table of real evidence are real research results, rules and cases; the sources are listed below.</w:t>
             </w:r>
           </w:p>
         </w:tc>
@@ -4626,7 +5671,7 @@
           <w:color w:val="556274"/>
           <w:sz w:val="18"/>
         </w:rPr>
-        <w:t>Rello et al. 2016 · Dyson 2004 · Beier 2012 · WCAG 2.2</w:t>
+        <w:t>Rello et al. 2016 · Dyson 2004 · Beier 2012 · WCAG 2.2 · Dyson &amp; Haselgrove 2001 · WHO 2019 · Apple HIG</w:t>
       </w:r>
     </w:p>
     <w:p>
@@ -4740,7 +5785,7 @@
             </w:r>
             <w:r>
               <w:rPr/>
-              <w:t xml:space="preserve"> The same Kettle &amp; Co help page in three forms: flat, with a clear hierarchy, and with too many styles.</w:t>
+              <w:t xml:space="preserve"> The same Kettle &amp; Co help page in three forms: flat, with a clear hierarchy, and with too many styles. A table of hierarchy and scanning findings follows.</w:t>
             </w:r>
           </w:p>
         </w:tc>
@@ -5119,6 +6164,319 @@
         <w:spacing w:before="0" w:after="80"/>
       </w:pPr>
     </w:p>
+    <w:p>
+      <w:pPr>
+        <w:spacing w:before="0" w:after="100"/>
+      </w:pPr>
+      <w:r>
+        <w:rPr>
+          <w:b/>
+        </w:rPr>
+        <w:t>Hierarchy and scanning: evidence</w:t>
+      </w:r>
+    </w:p>
+    <w:tbl>
+      <w:tblPr>
+        <w:tblW w:w="9638" w:type="dxa"/>
+        <w:tblBorders>
+          <w:top w:val="single" w:sz="4" w:space="0" w:color="D5DEE9"/>
+          <w:left w:val="single" w:sz="4" w:space="0" w:color="D5DEE9"/>
+          <w:bottom w:val="single" w:sz="4" w:space="0" w:color="D5DEE9"/>
+          <w:right w:val="single" w:sz="4" w:space="0" w:color="D5DEE9"/>
+          <w:insideH w:val="single" w:sz="4" w:space="0" w:color="D5DEE9"/>
+          <w:insideV w:val="single" w:sz="4" w:space="0" w:color="D5DEE9"/>
+        </w:tblBorders>
+        <w:tblLayout w:type="fixed"/>
+        <w:tblCellMar>
+          <w:top w:w="60" w:type="dxa"/>
+          <w:left w:w="100" w:type="dxa"/>
+          <w:bottom w:w="60" w:type="dxa"/>
+          <w:right w:w="100" w:type="dxa"/>
+        </w:tblCellMar>
+      </w:tblPr>
+      <w:tblGrid>
+        <w:gridCol w:w="1626"/>
+        <w:gridCol w:w="4894"/>
+        <w:gridCol w:w="3118"/>
+      </w:tblGrid>
+      <w:tr>
+        <w:trPr>
+          <w:cantSplit/>
+          <w:tblHeader/>
+        </w:trPr>
+        <w:tc>
+          <w:tcPr>
+            <w:tcW w:type="dxa" w:w="1626"/>
+            <w:shd w:val="clear" w:color="auto" w:fill="E6ECF4"/>
+          </w:tcPr>
+          <w:p>
+            <w:pPr>
+              <w:spacing w:before="0" w:after="0"/>
+            </w:pPr>
+            <w:r>
+              <w:rPr>
+                <w:b/>
+                <w:sz w:val="20"/>
+              </w:rPr>
+              <w:t>Topic</w:t>
+            </w:r>
+          </w:p>
+        </w:tc>
+        <w:tc>
+          <w:tcPr>
+            <w:tcW w:type="dxa" w:w="4894"/>
+            <w:shd w:val="clear" w:color="auto" w:fill="E6ECF4"/>
+          </w:tcPr>
+          <w:p>
+            <w:pPr>
+              <w:spacing w:before="0" w:after="0"/>
+            </w:pPr>
+            <w:r>
+              <w:rPr>
+                <w:b/>
+                <w:sz w:val="20"/>
+              </w:rPr>
+              <w:t>Real finding or rule</w:t>
+            </w:r>
+          </w:p>
+        </w:tc>
+        <w:tc>
+          <w:tcPr>
+            <w:tcW w:type="dxa" w:w="3118"/>
+            <w:shd w:val="clear" w:color="auto" w:fill="E6ECF4"/>
+          </w:tcPr>
+          <w:p>
+            <w:pPr>
+              <w:spacing w:before="0" w:after="0"/>
+            </w:pPr>
+            <w:r>
+              <w:rPr>
+                <w:b/>
+                <w:sz w:val="20"/>
+              </w:rPr>
+              <w:t>What it means for a screen</w:t>
+            </w:r>
+          </w:p>
+        </w:tc>
+      </w:tr>
+      <w:tr>
+        <w:trPr>
+          <w:cantSplit/>
+        </w:trPr>
+        <w:tc>
+          <w:tcPr>
+            <w:tcW w:type="dxa" w:w="1626"/>
+          </w:tcPr>
+          <w:p>
+            <w:pPr>
+              <w:spacing w:before="0" w:after="0"/>
+            </w:pPr>
+            <w:r>
+              <w:rPr>
+                <w:sz w:val="20"/>
+              </w:rPr>
+              <w:t>Scanning</w:t>
+            </w:r>
+          </w:p>
+        </w:tc>
+        <w:tc>
+          <w:tcPr>
+            <w:tcW w:type="dxa" w:w="4894"/>
+          </w:tcPr>
+          <w:p>
+            <w:pPr>
+              <w:spacing w:before="0" w:after="0"/>
+            </w:pPr>
+            <w:r>
+              <w:rPr>
+                <w:sz w:val="20"/>
+              </w:rPr>
+              <w:t>In eye-tracking of text pages the eyes follow an F-shape; headings, bullet points and bold key words change the pattern (Pernice 2017). 79% of users always scanned a new page (Nielsen and Morkes 1997).</w:t>
+            </w:r>
+          </w:p>
+        </w:tc>
+        <w:tc>
+          <w:tcPr>
+            <w:tcW w:type="dxa" w:w="3118"/>
+          </w:tcPr>
+          <w:p>
+            <w:pPr>
+              <w:spacing w:before="0" w:after="0"/>
+            </w:pPr>
+            <w:r>
+              <w:rPr>
+                <w:sz w:val="20"/>
+              </w:rPr>
+              <w:t>Make the headings carry the content, so a scan reads a summary.</w:t>
+            </w:r>
+          </w:p>
+        </w:tc>
+      </w:tr>
+      <w:tr>
+        <w:trPr>
+          <w:cantSplit/>
+        </w:trPr>
+        <w:tc>
+          <w:tcPr>
+            <w:tcW w:type="dxa" w:w="1626"/>
+          </w:tcPr>
+          <w:p>
+            <w:pPr>
+              <w:spacing w:before="0" w:after="0"/>
+            </w:pPr>
+            <w:r>
+              <w:rPr>
+                <w:sz w:val="20"/>
+              </w:rPr>
+              <w:t>Hierarchy as roles</w:t>
+            </w:r>
+          </w:p>
+        </w:tc>
+        <w:tc>
+          <w:tcPr>
+            <w:tcW w:type="dxa" w:w="4894"/>
+          </w:tcPr>
+          <w:p>
+            <w:pPr>
+              <w:spacing w:before="0" w:after="0"/>
+            </w:pPr>
+            <w:r>
+              <w:rPr>
+                <w:sz w:val="20"/>
+              </w:rPr>
+              <w:t>Apple's guidelines define named text styles for roles such as title, headline, body and footnote, so that size follows the role and grows with the size a person chooses (Dynamic Type).</w:t>
+            </w:r>
+          </w:p>
+        </w:tc>
+        <w:tc>
+          <w:tcPr>
+            <w:tcW w:type="dxa" w:w="3118"/>
+          </w:tcPr>
+          <w:p>
+            <w:pPr>
+              <w:spacing w:before="0" w:after="0"/>
+            </w:pPr>
+            <w:r>
+              <w:rPr>
+                <w:sz w:val="20"/>
+              </w:rPr>
+              <w:t>Define the hierarchy as roles with a size each, not as one-off sizes on single pages.</w:t>
+            </w:r>
+          </w:p>
+        </w:tc>
+      </w:tr>
+      <w:tr>
+        <w:trPr>
+          <w:cantSplit/>
+        </w:trPr>
+        <w:tc>
+          <w:tcPr>
+            <w:tcW w:type="dxa" w:w="1626"/>
+          </w:tcPr>
+          <w:p>
+            <w:pPr>
+              <w:spacing w:before="0" w:after="0"/>
+            </w:pPr>
+            <w:r>
+              <w:rPr>
+                <w:sz w:val="20"/>
+              </w:rPr>
+              <w:t>Structure for software</w:t>
+            </w:r>
+          </w:p>
+        </w:tc>
+        <w:tc>
+          <w:tcPr>
+            <w:tcW w:type="dxa" w:w="4894"/>
+          </w:tcPr>
+          <w:p>
+            <w:pPr>
+              <w:spacing w:before="0" w:after="0"/>
+            </w:pPr>
+            <w:r>
+              <w:rPr>
+                <w:sz w:val="20"/>
+              </w:rPr>
+              <w:t>Structure that is shown by looks must also be in the markup (WCAG 1.3.1). In the WebAIM survey of 2024, 71.6% of the screen reader users said they would first navigate by headings to find information on a long page (as reported).</w:t>
+            </w:r>
+          </w:p>
+        </w:tc>
+        <w:tc>
+          <w:tcPr>
+            <w:tcW w:type="dxa" w:w="3118"/>
+          </w:tcPr>
+          <w:p>
+            <w:pPr>
+              <w:spacing w:before="0" w:after="0"/>
+            </w:pPr>
+            <w:r>
+              <w:rPr>
+                <w:sz w:val="20"/>
+              </w:rPr>
+              <w:t>Use real headings in order, so the visual hierarchy is also the hierarchy for assistive technology.</w:t>
+            </w:r>
+          </w:p>
+        </w:tc>
+      </w:tr>
+      <w:tr>
+        <w:trPr>
+          <w:cantSplit/>
+        </w:trPr>
+        <w:tc>
+          <w:tcPr>
+            <w:tcW w:type="dxa" w:w="1626"/>
+          </w:tcPr>
+          <w:p>
+            <w:pPr>
+              <w:spacing w:before="0" w:after="0"/>
+            </w:pPr>
+            <w:r>
+              <w:rPr>
+                <w:sz w:val="20"/>
+              </w:rPr>
+              <w:t>Colour, type and structure together</w:t>
+            </w:r>
+          </w:p>
+        </w:tc>
+        <w:tc>
+          <w:tcPr>
+            <w:tcW w:type="dxa" w:w="4894"/>
+          </w:tcPr>
+          <w:p>
+            <w:pPr>
+              <w:spacing w:before="0" w:after="0"/>
+            </w:pPr>
+            <w:r>
+              <w:rPr>
+                <w:sz w:val="20"/>
+              </w:rPr>
+              <w:t>Contrast, size and position add up in the eye (Ware 2012).</w:t>
+            </w:r>
+          </w:p>
+        </w:tc>
+        <w:tc>
+          <w:tcPr>
+            <w:tcW w:type="dxa" w:w="3118"/>
+          </w:tcPr>
+          <w:p>
+            <w:pPr>
+              <w:spacing w:before="0" w:after="0"/>
+            </w:pPr>
+            <w:r>
+              <w:rPr>
+                <w:sz w:val="20"/>
+              </w:rPr>
+              <w:t>Make the strongest colour, the largest size and the first position point at the same thing.</w:t>
+            </w:r>
+          </w:p>
+        </w:tc>
+      </w:tr>
+    </w:tbl>
+    <w:p>
+      <w:pPr>
+        <w:spacing w:before="0" w:after="80"/>
+      </w:pPr>
+    </w:p>
     <w:tbl>
       <w:tblPr>
         <w:tblW w:w="9598" w:type="dxa"/>
@@ -5168,7 +6526,7 @@
             </w:pPr>
             <w:r>
               <w:rPr/>
-              <w:t>Kettle &amp; Co, Rosa, Theo, Ines and Karim are made up for this example. Hierarchy as a service to the reader follows Bringhurst (2004); headings that change how people scan follow Pernice (2017).</w:t>
+              <w:t>Kettle &amp; Co, Rosa, Theo, Ines and Karim are made up for this example. Hierarchy as a service to the reader follows Bringhurst (2004); headings that change how people scan follow Pernice (2017). The findings in the table of real evidence are real research results, rules and cases; the sources are listed below.</w:t>
             </w:r>
           </w:p>
         </w:tc>
@@ -5357,7 +6715,7 @@
           <w:color w:val="556274"/>
           <w:sz w:val="18"/>
         </w:rPr>
-        <w:t>Bringhurst 2004 · Pernice 2017 · Nielsen 1994</w:t>
+        <w:t>Bringhurst 2004 · Pernice 2017 · Nielsen 1994 · Nielsen 1997 · WCAG 2.2 · WebAIM 2024 · Ware 2012</w:t>
       </w:r>
     </w:p>
     <w:p>
@@ -5366,7 +6724,7 @@
       </w:pPr>
       <w:r>
         <w:rPr/>
-        <w:t>A5 · From colour and type to behaviour, and weighing a measure · 12 min · Core</w:t>
+        <w:t>A5 · From colour and type to behaviour, and weighing a measure · 11 min · Core</w:t>
       </w:r>
     </w:p>
     <w:p>
@@ -5471,7 +6829,7 @@
             </w:r>
             <w:r>
               <w:rPr/>
-              <w:t xml:space="preserve"> Three measures Kettle &amp; Co considered, rated on effect on users, feasibility, risk and time pressure. A rating is a reading of the example, not a mark.</w:t>
+              <w:t xml:space="preserve"> Three measures Kettle &amp; Co considered, rated on effect on users, feasibility, risk and time pressure. A rating is a reading of the example, not a mark. A table of findings on behaviour, understanding and trust follows.</w:t>
             </w:r>
           </w:p>
         </w:tc>
@@ -5537,6 +6895,319 @@
         <w:t>Figure 5 · Kettle &amp; Co weighs three measures on effect on users, feasibility, risk and time pressure.</w:t>
       </w:r>
     </w:p>
+    <w:p>
+      <w:pPr>
+        <w:spacing w:before="0" w:after="100"/>
+      </w:pPr>
+      <w:r>
+        <w:rPr>
+          <w:b/>
+        </w:rPr>
+        <w:t>Colour and type change behaviour, understanding and trust: findings</w:t>
+      </w:r>
+    </w:p>
+    <w:tbl>
+      <w:tblPr>
+        <w:tblW w:w="9638" w:type="dxa"/>
+        <w:tblBorders>
+          <w:top w:val="single" w:sz="4" w:space="0" w:color="D5DEE9"/>
+          <w:left w:val="single" w:sz="4" w:space="0" w:color="D5DEE9"/>
+          <w:bottom w:val="single" w:sz="4" w:space="0" w:color="D5DEE9"/>
+          <w:right w:val="single" w:sz="4" w:space="0" w:color="D5DEE9"/>
+          <w:insideH w:val="single" w:sz="4" w:space="0" w:color="D5DEE9"/>
+          <w:insideV w:val="single" w:sz="4" w:space="0" w:color="D5DEE9"/>
+        </w:tblBorders>
+        <w:tblLayout w:type="fixed"/>
+        <w:tblCellMar>
+          <w:top w:w="60" w:type="dxa"/>
+          <w:left w:w="100" w:type="dxa"/>
+          <w:bottom w:w="60" w:type="dxa"/>
+          <w:right w:w="100" w:type="dxa"/>
+        </w:tblCellMar>
+      </w:tblPr>
+      <w:tblGrid>
+        <w:gridCol w:w="1859"/>
+        <w:gridCol w:w="4595"/>
+        <w:gridCol w:w="3184"/>
+      </w:tblGrid>
+      <w:tr>
+        <w:trPr>
+          <w:cantSplit/>
+          <w:tblHeader/>
+        </w:trPr>
+        <w:tc>
+          <w:tcPr>
+            <w:tcW w:type="dxa" w:w="1859"/>
+            <w:shd w:val="clear" w:color="auto" w:fill="E6ECF4"/>
+          </w:tcPr>
+          <w:p>
+            <w:pPr>
+              <w:spacing w:before="0" w:after="0"/>
+            </w:pPr>
+            <w:r>
+              <w:rPr>
+                <w:b/>
+                <w:sz w:val="20"/>
+              </w:rPr>
+              <w:t>Effect</w:t>
+            </w:r>
+          </w:p>
+        </w:tc>
+        <w:tc>
+          <w:tcPr>
+            <w:tcW w:type="dxa" w:w="4595"/>
+            <w:shd w:val="clear" w:color="auto" w:fill="E6ECF4"/>
+          </w:tcPr>
+          <w:p>
+            <w:pPr>
+              <w:spacing w:before="0" w:after="0"/>
+            </w:pPr>
+            <w:r>
+              <w:rPr>
+                <w:b/>
+                <w:sz w:val="20"/>
+              </w:rPr>
+              <w:t>Real finding</w:t>
+            </w:r>
+          </w:p>
+        </w:tc>
+        <w:tc>
+          <w:tcPr>
+            <w:tcW w:type="dxa" w:w="3184"/>
+            <w:shd w:val="clear" w:color="auto" w:fill="E6ECF4"/>
+          </w:tcPr>
+          <w:p>
+            <w:pPr>
+              <w:spacing w:before="0" w:after="0"/>
+            </w:pPr>
+            <w:r>
+              <w:rPr>
+                <w:b/>
+                <w:sz w:val="20"/>
+              </w:rPr>
+              <w:t>What it means for a measure</w:t>
+            </w:r>
+          </w:p>
+        </w:tc>
+      </w:tr>
+      <w:tr>
+        <w:trPr>
+          <w:cantSplit/>
+        </w:trPr>
+        <w:tc>
+          <w:tcPr>
+            <w:tcW w:type="dxa" w:w="1859"/>
+          </w:tcPr>
+          <w:p>
+            <w:pPr>
+              <w:spacing w:before="0" w:after="0"/>
+            </w:pPr>
+            <w:r>
+              <w:rPr>
+                <w:sz w:val="20"/>
+              </w:rPr>
+              <w:t>Behaviour</w:t>
+            </w:r>
+          </w:p>
+        </w:tc>
+        <w:tc>
+          <w:tcPr>
+            <w:tcW w:type="dxa" w:w="4595"/>
+          </w:tcPr>
+          <w:p>
+            <w:pPr>
+              <w:spacing w:before="0" w:after="0"/>
+            </w:pPr>
+            <w:r>
+              <w:rPr>
+                <w:sz w:val="20"/>
+              </w:rPr>
+              <w:t>Comprehension of on-screen text rose with larger type (Rello et al. 2016).</w:t>
+            </w:r>
+          </w:p>
+        </w:tc>
+        <w:tc>
+          <w:tcPr>
+            <w:tcW w:type="dxa" w:w="3184"/>
+          </w:tcPr>
+          <w:p>
+            <w:pPr>
+              <w:spacing w:before="0" w:after="0"/>
+            </w:pPr>
+            <w:r>
+              <w:rPr>
+                <w:sz w:val="20"/>
+              </w:rPr>
+              <w:t>A size change is a measure with a visible effect on whether people understand.</w:t>
+            </w:r>
+          </w:p>
+        </w:tc>
+      </w:tr>
+      <w:tr>
+        <w:trPr>
+          <w:cantSplit/>
+        </w:trPr>
+        <w:tc>
+          <w:tcPr>
+            <w:tcW w:type="dxa" w:w="1859"/>
+          </w:tcPr>
+          <w:p>
+            <w:pPr>
+              <w:spacing w:before="0" w:after="0"/>
+            </w:pPr>
+            <w:r>
+              <w:rPr>
+                <w:sz w:val="20"/>
+              </w:rPr>
+              <w:t>Understanding</w:t>
+            </w:r>
+          </w:p>
+        </w:tc>
+        <w:tc>
+          <w:tcPr>
+            <w:tcW w:type="dxa" w:w="4595"/>
+          </w:tcPr>
+          <w:p>
+            <w:pPr>
+              <w:spacing w:before="0" w:after="0"/>
+            </w:pPr>
+            <w:r>
+              <w:rPr>
+                <w:sz w:val="20"/>
+              </w:rPr>
+              <w:t>Design appeal predicted whether women searching for health advice rejected a site (Sillence et al. 2004).</w:t>
+            </w:r>
+          </w:p>
+        </w:tc>
+        <w:tc>
+          <w:tcPr>
+            <w:tcW w:type="dxa" w:w="3184"/>
+          </w:tcPr>
+          <w:p>
+            <w:pPr>
+              <w:spacing w:before="0" w:after="0"/>
+            </w:pPr>
+            <w:r>
+              <w:rPr>
+                <w:sz w:val="20"/>
+              </w:rPr>
+              <w:t>A page that looks careless is rejected before its content is judged.</w:t>
+            </w:r>
+          </w:p>
+        </w:tc>
+      </w:tr>
+      <w:tr>
+        <w:trPr>
+          <w:cantSplit/>
+        </w:trPr>
+        <w:tc>
+          <w:tcPr>
+            <w:tcW w:type="dxa" w:w="1859"/>
+          </w:tcPr>
+          <w:p>
+            <w:pPr>
+              <w:spacing w:before="0" w:after="0"/>
+            </w:pPr>
+            <w:r>
+              <w:rPr>
+                <w:sz w:val="20"/>
+              </w:rPr>
+              <w:t>Trust</w:t>
+            </w:r>
+          </w:p>
+        </w:tc>
+        <w:tc>
+          <w:tcPr>
+            <w:tcW w:type="dxa" w:w="4595"/>
+          </w:tcPr>
+          <w:p>
+            <w:pPr>
+              <w:spacing w:before="0" w:after="0"/>
+            </w:pPr>
+            <w:r>
+              <w:rPr>
+                <w:sz w:val="20"/>
+              </w:rPr>
+              <w:t>The design look was the factor named most often when 2,684 people judged the credibility of 100 websites, in 46.1% of their comments (Fogg et al. 2003).</w:t>
+            </w:r>
+          </w:p>
+        </w:tc>
+        <w:tc>
+          <w:tcPr>
+            <w:tcW w:type="dxa" w:w="3184"/>
+          </w:tcPr>
+          <w:p>
+            <w:pPr>
+              <w:spacing w:before="0" w:after="0"/>
+            </w:pPr>
+            <w:r>
+              <w:rPr>
+                <w:sz w:val="20"/>
+              </w:rPr>
+              <w:t>Type and colour are read as signs of care and seriousness.</w:t>
+            </w:r>
+          </w:p>
+        </w:tc>
+      </w:tr>
+      <w:tr>
+        <w:trPr>
+          <w:cantSplit/>
+        </w:trPr>
+        <w:tc>
+          <w:tcPr>
+            <w:tcW w:type="dxa" w:w="1859"/>
+          </w:tcPr>
+          <w:p>
+            <w:pPr>
+              <w:spacing w:before="0" w:after="0"/>
+            </w:pPr>
+            <w:r>
+              <w:rPr>
+                <w:sz w:val="20"/>
+              </w:rPr>
+              <w:t>Weighing</w:t>
+            </w:r>
+          </w:p>
+        </w:tc>
+        <w:tc>
+          <w:tcPr>
+            <w:tcW w:type="dxa" w:w="4595"/>
+          </w:tcPr>
+          <w:p>
+            <w:pPr>
+              <w:spacing w:before="0" w:after="0"/>
+            </w:pPr>
+            <w:r>
+              <w:rPr>
+                <w:sz w:val="20"/>
+              </w:rPr>
+              <w:t>A colour or type measure is cheap to build and expensive to coordinate: rate its effect, effort, risk and time pressure with a reason (Gibbons 2018).</w:t>
+            </w:r>
+          </w:p>
+        </w:tc>
+        <w:tc>
+          <w:tcPr>
+            <w:tcW w:type="dxa" w:w="3184"/>
+          </w:tcPr>
+          <w:p>
+            <w:pPr>
+              <w:spacing w:before="0" w:after="0"/>
+            </w:pPr>
+            <w:r>
+              <w:rPr>
+                <w:sz w:val="20"/>
+              </w:rPr>
+              <w:t>Write the reason next to the rating, so it can be checked later.</w:t>
+            </w:r>
+          </w:p>
+        </w:tc>
+      </w:tr>
+    </w:tbl>
+    <w:p>
+      <w:pPr>
+        <w:spacing w:before="0" w:after="80"/>
+      </w:pPr>
+    </w:p>
     <w:tbl>
       <w:tblPr>
         <w:tblW w:w="9598" w:type="dxa"/>
@@ -5586,7 +7257,7 @@
             </w:pPr>
             <w:r>
               <w:rPr/>
-              <w:t>Kettle &amp; Co, Rosa, Theo, Ines and Karim are made up for this example. Rating options on the same criteria with a reason follows Gibbons (2018). The four criteria are the ones the plan names for the case study.</w:t>
+              <w:t>Kettle &amp; Co, Rosa, Theo, Ines and Karim are made up for this example. Rating options on the same criteria with a reason follows Gibbons (2018). The four criteria are the ones the plan names for the case study. The findings in the table of real evidence are real research results, rules and cases; the sources are listed below.</w:t>
             </w:r>
           </w:p>
         </w:tc>
@@ -5775,7 +7446,7 @@
           <w:color w:val="556274"/>
           <w:sz w:val="18"/>
         </w:rPr>
-        <w:t>Gibbons 2018 · Nielsen 1994 · WCAG 2.2</w:t>
+        <w:t>Gibbons 2018 · Nielsen 1994 · WCAG 2.2 · Rello et al. 2016 · Sillence et al. 2004 · Fogg et al. 2003</w:t>
       </w:r>
     </w:p>
     <w:p>
@@ -5961,7 +7632,7 @@
             </w:r>
             <w:r>
               <w:rPr/>
-              <w:t xml:space="preserve"> Left the same Kettle &amp; Co elements decided campaign by campaign, right decided once as rules. Below, the chain from the brand to the screens.</w:t>
+              <w:t xml:space="preserve"> Left the same Kettle &amp; Co elements decided campaign by campaign, right decided once as rules. Below, the chain from the brand to the screens. A table of real systems follows.</w:t>
             </w:r>
           </w:p>
         </w:tc>
@@ -6082,6 +7753,319 @@
         <w:t>Figure 7 · From the brand to the screens: where colour and type are decided.</w:t>
       </w:r>
     </w:p>
+    <w:p>
+      <w:pPr>
+        <w:spacing w:before="0" w:after="100"/>
+      </w:pPr>
+      <w:r>
+        <w:rPr>
+          <w:b/>
+        </w:rPr>
+        <w:t>Colour and type as strategic decisions: real systems</w:t>
+      </w:r>
+    </w:p>
+    <w:tbl>
+      <w:tblPr>
+        <w:tblW w:w="9638" w:type="dxa"/>
+        <w:tblBorders>
+          <w:top w:val="single" w:sz="4" w:space="0" w:color="D5DEE9"/>
+          <w:left w:val="single" w:sz="4" w:space="0" w:color="D5DEE9"/>
+          <w:bottom w:val="single" w:sz="4" w:space="0" w:color="D5DEE9"/>
+          <w:right w:val="single" w:sz="4" w:space="0" w:color="D5DEE9"/>
+          <w:insideH w:val="single" w:sz="4" w:space="0" w:color="D5DEE9"/>
+          <w:insideV w:val="single" w:sz="4" w:space="0" w:color="D5DEE9"/>
+        </w:tblBorders>
+        <w:tblLayout w:type="fixed"/>
+        <w:tblCellMar>
+          <w:top w:w="60" w:type="dxa"/>
+          <w:left w:w="100" w:type="dxa"/>
+          <w:bottom w:w="60" w:type="dxa"/>
+          <w:right w:w="100" w:type="dxa"/>
+        </w:tblCellMar>
+      </w:tblPr>
+      <w:tblGrid>
+        <w:gridCol w:w="1841"/>
+        <w:gridCol w:w="4916"/>
+        <w:gridCol w:w="2881"/>
+      </w:tblGrid>
+      <w:tr>
+        <w:trPr>
+          <w:cantSplit/>
+          <w:tblHeader/>
+        </w:trPr>
+        <w:tc>
+          <w:tcPr>
+            <w:tcW w:type="dxa" w:w="1841"/>
+            <w:shd w:val="clear" w:color="auto" w:fill="E6ECF4"/>
+          </w:tcPr>
+          <w:p>
+            <w:pPr>
+              <w:spacing w:before="0" w:after="0"/>
+            </w:pPr>
+            <w:r>
+              <w:rPr>
+                <w:b/>
+                <w:sz w:val="20"/>
+              </w:rPr>
+              <w:t>Decision</w:t>
+            </w:r>
+          </w:p>
+        </w:tc>
+        <w:tc>
+          <w:tcPr>
+            <w:tcW w:type="dxa" w:w="4916"/>
+            <w:shd w:val="clear" w:color="auto" w:fill="E6ECF4"/>
+          </w:tcPr>
+          <w:p>
+            <w:pPr>
+              <w:spacing w:before="0" w:after="0"/>
+            </w:pPr>
+            <w:r>
+              <w:rPr>
+                <w:b/>
+                <w:sz w:val="20"/>
+              </w:rPr>
+              <w:t>Real example</w:t>
+            </w:r>
+          </w:p>
+        </w:tc>
+        <w:tc>
+          <w:tcPr>
+            <w:tcW w:type="dxa" w:w="2881"/>
+            <w:shd w:val="clear" w:color="auto" w:fill="E6ECF4"/>
+          </w:tcPr>
+          <w:p>
+            <w:pPr>
+              <w:spacing w:before="0" w:after="0"/>
+            </w:pPr>
+            <w:r>
+              <w:rPr>
+                <w:b/>
+                <w:sz w:val="20"/>
+              </w:rPr>
+              <w:t>What it means</w:t>
+            </w:r>
+          </w:p>
+        </w:tc>
+      </w:tr>
+      <w:tr>
+        <w:trPr>
+          <w:cantSplit/>
+        </w:trPr>
+        <w:tc>
+          <w:tcPr>
+            <w:tcW w:type="dxa" w:w="1841"/>
+          </w:tcPr>
+          <w:p>
+            <w:pPr>
+              <w:spacing w:before="0" w:after="0"/>
+            </w:pPr>
+            <w:r>
+              <w:rPr>
+                <w:sz w:val="20"/>
+              </w:rPr>
+              <w:t>A rule instead of a choice per page</w:t>
+            </w:r>
+          </w:p>
+        </w:tc>
+        <w:tc>
+          <w:tcPr>
+            <w:tcW w:type="dxa" w:w="4916"/>
+          </w:tcPr>
+          <w:p>
+            <w:pPr>
+              <w:spacing w:before="0" w:after="0"/>
+            </w:pPr>
+            <w:r>
+              <w:rPr>
+                <w:sz w:val="20"/>
+              </w:rPr>
+              <w:t>Atomic design builds interfaces from shared rules and components, from colours and type styles up to whole pages (Frost 2016).</w:t>
+            </w:r>
+          </w:p>
+        </w:tc>
+        <w:tc>
+          <w:tcPr>
+            <w:tcW w:type="dxa" w:w="2881"/>
+          </w:tcPr>
+          <w:p>
+            <w:pPr>
+              <w:spacing w:before="0" w:after="0"/>
+            </w:pPr>
+            <w:r>
+              <w:rPr>
+                <w:sz w:val="20"/>
+              </w:rPr>
+              <w:t>The decision about colour and type is taken once, as a rule.</w:t>
+            </w:r>
+          </w:p>
+        </w:tc>
+      </w:tr>
+      <w:tr>
+        <w:trPr>
+          <w:cantSplit/>
+        </w:trPr>
+        <w:tc>
+          <w:tcPr>
+            <w:tcW w:type="dxa" w:w="1841"/>
+          </w:tcPr>
+          <w:p>
+            <w:pPr>
+              <w:spacing w:before="0" w:after="0"/>
+            </w:pPr>
+            <w:r>
+              <w:rPr>
+                <w:sz w:val="20"/>
+              </w:rPr>
+              <w:t>Roles instead of sizes</w:t>
+            </w:r>
+          </w:p>
+        </w:tc>
+        <w:tc>
+          <w:tcPr>
+            <w:tcW w:type="dxa" w:w="4916"/>
+          </w:tcPr>
+          <w:p>
+            <w:pPr>
+              <w:spacing w:before="0" w:after="0"/>
+            </w:pPr>
+            <w:r>
+              <w:rPr>
+                <w:sz w:val="20"/>
+              </w:rPr>
+              <w:t>Apple's text styles tie size to role and let people choose their own size (Dynamic Type); a design built on roles survives that choice.</w:t>
+            </w:r>
+          </w:p>
+        </w:tc>
+        <w:tc>
+          <w:tcPr>
+            <w:tcW w:type="dxa" w:w="2881"/>
+          </w:tcPr>
+          <w:p>
+            <w:pPr>
+              <w:spacing w:before="0" w:after="0"/>
+            </w:pPr>
+            <w:r>
+              <w:rPr>
+                <w:sz w:val="20"/>
+              </w:rPr>
+              <w:t>A decision about type should hold when the user changes the size.</w:t>
+            </w:r>
+          </w:p>
+        </w:tc>
+      </w:tr>
+      <w:tr>
+        <w:trPr>
+          <w:cantSplit/>
+        </w:trPr>
+        <w:tc>
+          <w:tcPr>
+            <w:tcW w:type="dxa" w:w="1841"/>
+          </w:tcPr>
+          <w:p>
+            <w:pPr>
+              <w:spacing w:before="0" w:after="0"/>
+            </w:pPr>
+            <w:r>
+              <w:rPr>
+                <w:sz w:val="20"/>
+              </w:rPr>
+              <w:t>A standard as the floor</w:t>
+            </w:r>
+          </w:p>
+        </w:tc>
+        <w:tc>
+          <w:tcPr>
+            <w:tcW w:type="dxa" w:w="4916"/>
+          </w:tcPr>
+          <w:p>
+            <w:pPr>
+              <w:spacing w:before="0" w:after="0"/>
+            </w:pPr>
+            <w:r>
+              <w:rPr>
+                <w:sz w:val="20"/>
+              </w:rPr>
+              <w:t>WCAG 2.2 sets the floor: contrast of 4.5 to 1 for text and 3 to 1 for large text and controls, text enlargement to 200%, and text spacing that users can change.</w:t>
+            </w:r>
+          </w:p>
+        </w:tc>
+        <w:tc>
+          <w:tcPr>
+            <w:tcW w:type="dxa" w:w="2881"/>
+          </w:tcPr>
+          <w:p>
+            <w:pPr>
+              <w:spacing w:before="0" w:after="0"/>
+            </w:pPr>
+            <w:r>
+              <w:rPr>
+                <w:sz w:val="20"/>
+              </w:rPr>
+              <w:t>Brand choices are made above the floor, not below it.</w:t>
+            </w:r>
+          </w:p>
+        </w:tc>
+      </w:tr>
+      <w:tr>
+        <w:trPr>
+          <w:cantSplit/>
+        </w:trPr>
+        <w:tc>
+          <w:tcPr>
+            <w:tcW w:type="dxa" w:w="1841"/>
+          </w:tcPr>
+          <w:p>
+            <w:pPr>
+              <w:spacing w:before="0" w:after="0"/>
+            </w:pPr>
+            <w:r>
+              <w:rPr>
+                <w:sz w:val="20"/>
+              </w:rPr>
+              <w:t>Colour shapes the brand</w:t>
+            </w:r>
+          </w:p>
+        </w:tc>
+        <w:tc>
+          <w:tcPr>
+            <w:tcW w:type="dxa" w:w="4916"/>
+          </w:tcPr>
+          <w:p>
+            <w:pPr>
+              <w:spacing w:before="0" w:after="0"/>
+            </w:pPr>
+            <w:r>
+              <w:rPr>
+                <w:sz w:val="20"/>
+              </w:rPr>
+              <w:t>Colour shapes how a brand is perceived (Labrecque and Milne 2012).</w:t>
+            </w:r>
+          </w:p>
+        </w:tc>
+        <w:tc>
+          <w:tcPr>
+            <w:tcW w:type="dxa" w:w="2881"/>
+          </w:tcPr>
+          <w:p>
+            <w:pPr>
+              <w:spacing w:before="0" w:after="0"/>
+            </w:pPr>
+            <w:r>
+              <w:rPr>
+                <w:sz w:val="20"/>
+              </w:rPr>
+              <w:t>A colour decision is a decision about the brand, not only about looks.</w:t>
+            </w:r>
+          </w:p>
+        </w:tc>
+      </w:tr>
+    </w:tbl>
+    <w:p>
+      <w:pPr>
+        <w:spacing w:before="0" w:after="80"/>
+      </w:pPr>
+    </w:p>
     <w:tbl>
       <w:tblPr>
         <w:tblW w:w="9598" w:type="dxa"/>
@@ -6131,7 +8115,7 @@
             </w:pPr>
             <w:r>
               <w:rPr/>
-              <w:t>Kettle &amp; Co, Rosa, Theo, Ines and Karim are made up for this example. Building interfaces from shared rules and components follows Frost (2016); consistency and standards is Nielsen's heuristic (1994).</w:t>
+              <w:t>Kettle &amp; Co, Rosa, Theo, Ines and Karim are made up for this example. Building interfaces from shared rules and components follows Frost (2016); consistency and standards is Nielsen's heuristic (1994). The findings in the table of real evidence are real research results, rules and cases; the sources are listed below.</w:t>
             </w:r>
           </w:p>
         </w:tc>
@@ -6320,7 +8304,7 @@
           <w:color w:val="556274"/>
           <w:sz w:val="18"/>
         </w:rPr>
-        <w:t>Frost 2016 · Nielsen 1994 · Labrecque &amp; Milne 2012</w:t>
+        <w:t>Frost 2016 · Nielsen 1994 · Labrecque &amp; Milne 2012 · Apple HIG · WCAG 2.2</w:t>
       </w:r>
     </w:p>
     <w:p>
@@ -6434,7 +8418,7 @@
             </w:r>
             <w:r>
               <w:rPr/>
-              <w:t xml:space="preserve"> The matrix places five Kettle &amp; Co designs by how readable they are (to the right) and how strongly they carry the brand (upwards). A position is a reading of the example, not a score.</w:t>
+              <w:t xml:space="preserve"> The matrix places five Kettle &amp; Co designs by how readable they are (to the right) and how strongly they carry the brand (upwards). A position is a reading of the example, not a score. A table of conflicts with evidence follows.</w:t>
             </w:r>
           </w:p>
         </w:tc>
@@ -6760,6 +8744,266 @@
         <w:spacing w:before="0" w:after="80"/>
       </w:pPr>
     </w:p>
+    <w:p>
+      <w:pPr>
+        <w:spacing w:before="0" w:after="100"/>
+      </w:pPr>
+      <w:r>
+        <w:rPr>
+          <w:b/>
+        </w:rPr>
+        <w:t>Conflicts of colour and type, with evidence</w:t>
+      </w:r>
+    </w:p>
+    <w:tbl>
+      <w:tblPr>
+        <w:tblW w:w="9638" w:type="dxa"/>
+        <w:tblBorders>
+          <w:top w:val="single" w:sz="4" w:space="0" w:color="D5DEE9"/>
+          <w:left w:val="single" w:sz="4" w:space="0" w:color="D5DEE9"/>
+          <w:bottom w:val="single" w:sz="4" w:space="0" w:color="D5DEE9"/>
+          <w:right w:val="single" w:sz="4" w:space="0" w:color="D5DEE9"/>
+          <w:insideH w:val="single" w:sz="4" w:space="0" w:color="D5DEE9"/>
+          <w:insideV w:val="single" w:sz="4" w:space="0" w:color="D5DEE9"/>
+        </w:tblBorders>
+        <w:tblLayout w:type="fixed"/>
+        <w:tblCellMar>
+          <w:top w:w="60" w:type="dxa"/>
+          <w:left w:w="100" w:type="dxa"/>
+          <w:bottom w:w="60" w:type="dxa"/>
+          <w:right w:w="100" w:type="dxa"/>
+        </w:tblCellMar>
+      </w:tblPr>
+      <w:tblGrid>
+        <w:gridCol w:w="2458"/>
+        <w:gridCol w:w="4043"/>
+        <w:gridCol w:w="3137"/>
+      </w:tblGrid>
+      <w:tr>
+        <w:trPr>
+          <w:cantSplit/>
+          <w:tblHeader/>
+        </w:trPr>
+        <w:tc>
+          <w:tcPr>
+            <w:tcW w:type="dxa" w:w="2458"/>
+            <w:shd w:val="clear" w:color="auto" w:fill="E6ECF4"/>
+          </w:tcPr>
+          <w:p>
+            <w:pPr>
+              <w:spacing w:before="0" w:after="0"/>
+            </w:pPr>
+            <w:r>
+              <w:rPr>
+                <w:b/>
+                <w:sz w:val="20"/>
+              </w:rPr>
+              <w:t>Conflict</w:t>
+            </w:r>
+          </w:p>
+        </w:tc>
+        <w:tc>
+          <w:tcPr>
+            <w:tcW w:type="dxa" w:w="4043"/>
+            <w:shd w:val="clear" w:color="auto" w:fill="E6ECF4"/>
+          </w:tcPr>
+          <w:p>
+            <w:pPr>
+              <w:spacing w:before="0" w:after="0"/>
+            </w:pPr>
+            <w:r>
+              <w:rPr>
+                <w:b/>
+                <w:sz w:val="20"/>
+              </w:rPr>
+              <w:t>What the evidence says</w:t>
+            </w:r>
+          </w:p>
+        </w:tc>
+        <w:tc>
+          <w:tcPr>
+            <w:tcW w:type="dxa" w:w="3137"/>
+            <w:shd w:val="clear" w:color="auto" w:fill="E6ECF4"/>
+          </w:tcPr>
+          <w:p>
+            <w:pPr>
+              <w:spacing w:before="0" w:after="0"/>
+            </w:pPr>
+            <w:r>
+              <w:rPr>
+                <w:b/>
+                <w:sz w:val="20"/>
+              </w:rPr>
+              <w:t>A way to decide</w:t>
+            </w:r>
+          </w:p>
+        </w:tc>
+      </w:tr>
+      <w:tr>
+        <w:trPr>
+          <w:cantSplit/>
+        </w:trPr>
+        <w:tc>
+          <w:tcPr>
+            <w:tcW w:type="dxa" w:w="2458"/>
+          </w:tcPr>
+          <w:p>
+            <w:pPr>
+              <w:spacing w:before="0" w:after="0"/>
+            </w:pPr>
+            <w:r>
+              <w:rPr>
+                <w:sz w:val="20"/>
+              </w:rPr>
+              <w:t>Brand against accessibility</w:t>
+            </w:r>
+          </w:p>
+        </w:tc>
+        <w:tc>
+          <w:tcPr>
+            <w:tcW w:type="dxa" w:w="4043"/>
+          </w:tcPr>
+          <w:p>
+            <w:pPr>
+              <w:spacing w:before="0" w:after="0"/>
+            </w:pPr>
+            <w:r>
+              <w:rPr>
+                <w:sz w:val="20"/>
+              </w:rPr>
+              <w:t>At least 2.2 billion people have a vision impairment (World Health Organization 2019); WCAG sets minimum contrast and text enlargement.</w:t>
+            </w:r>
+          </w:p>
+        </w:tc>
+        <w:tc>
+          <w:tcPr>
+            <w:tcW w:type="dxa" w:w="3137"/>
+          </w:tcPr>
+          <w:p>
+            <w:pPr>
+              <w:spacing w:before="0" w:after="0"/>
+            </w:pPr>
+            <w:r>
+              <w:rPr>
+                <w:sz w:val="20"/>
+              </w:rPr>
+              <w:t>Let the brand live in large areas and headlines, and keep text and controls above the WCAG floor.</w:t>
+            </w:r>
+          </w:p>
+        </w:tc>
+      </w:tr>
+      <w:tr>
+        <w:trPr>
+          <w:cantSplit/>
+        </w:trPr>
+        <w:tc>
+          <w:tcPr>
+            <w:tcW w:type="dxa" w:w="2458"/>
+          </w:tcPr>
+          <w:p>
+            <w:pPr>
+              <w:spacing w:before="0" w:after="0"/>
+            </w:pPr>
+            <w:r>
+              <w:rPr>
+                <w:sz w:val="20"/>
+              </w:rPr>
+              <w:t>Clarity against activation</w:t>
+            </w:r>
+          </w:p>
+        </w:tc>
+        <w:tc>
+          <w:tcPr>
+            <w:tcW w:type="dxa" w:w="4043"/>
+          </w:tcPr>
+          <w:p>
+            <w:pPr>
+              <w:spacing w:before="0" w:after="0"/>
+            </w:pPr>
+            <w:r>
+              <w:rPr>
+                <w:sz w:val="20"/>
+              </w:rPr>
+              <w:t>The effect of colour on activity depends on the task: red went with detail work and blue with creative work (Mehta and Zhu 2009).</w:t>
+            </w:r>
+          </w:p>
+        </w:tc>
+        <w:tc>
+          <w:tcPr>
+            <w:tcW w:type="dxa" w:w="3137"/>
+          </w:tcPr>
+          <w:p>
+            <w:pPr>
+              <w:spacing w:before="0" w:after="0"/>
+            </w:pPr>
+            <w:r>
+              <w:rPr>
+                <w:sz w:val="20"/>
+              </w:rPr>
+              <w:t>Allow one loud element, chosen for the task, and keep the rest calm.</w:t>
+            </w:r>
+          </w:p>
+        </w:tc>
+      </w:tr>
+      <w:tr>
+        <w:trPr>
+          <w:cantSplit/>
+        </w:trPr>
+        <w:tc>
+          <w:tcPr>
+            <w:tcW w:type="dxa" w:w="2458"/>
+          </w:tcPr>
+          <w:p>
+            <w:pPr>
+              <w:spacing w:before="0" w:after="0"/>
+            </w:pPr>
+            <w:r>
+              <w:rPr>
+                <w:sz w:val="20"/>
+              </w:rPr>
+              <w:t>Standardisation against freedom</w:t>
+            </w:r>
+          </w:p>
+        </w:tc>
+        <w:tc>
+          <w:tcPr>
+            <w:tcW w:type="dxa" w:w="4043"/>
+          </w:tcPr>
+          <w:p>
+            <w:pPr>
+              <w:spacing w:before="0" w:after="0"/>
+            </w:pPr>
+            <w:r>
+              <w:rPr>
+                <w:sz w:val="20"/>
+              </w:rPr>
+              <w:t>Roles and shared components keep a product consistent (Frost 2016; Apple's text styles).</w:t>
+            </w:r>
+          </w:p>
+        </w:tc>
+        <w:tc>
+          <w:tcPr>
+            <w:tcW w:type="dxa" w:w="3137"/>
+          </w:tcPr>
+          <w:p>
+            <w:pPr>
+              <w:spacing w:before="0" w:after="0"/>
+            </w:pPr>
+            <w:r>
+              <w:rPr>
+                <w:sz w:val="20"/>
+              </w:rPr>
+              <w:t>Fix buttons, states and body text by rule; allow freedom in campaign images and headlines.</w:t>
+            </w:r>
+          </w:p>
+        </w:tc>
+      </w:tr>
+    </w:tbl>
+    <w:p>
+      <w:pPr>
+        <w:spacing w:before="0" w:after="80"/>
+      </w:pPr>
+    </w:p>
     <w:tbl>
       <w:tblPr>
         <w:tblW w:w="9598" w:type="dxa"/>
@@ -6809,7 +9053,7 @@
             </w:pPr>
             <w:r>
               <w:rPr/>
-              <w:t>Kettle &amp; Co, Rosa, Theo, Ines and Karim are made up for this example. The minimum contrast and the use of colour follow WCAG 2.2; the matrix is a reading of the example, not a score.</w:t>
+              <w:t>Kettle &amp; Co, Rosa, Theo, Ines and Karim are made up for this example. The minimum contrast and the use of colour follow WCAG 2.2; the matrix is a reading of the example, not a score. The findings in the table of real evidence are real research results, rules and cases; the sources are listed below.</w:t>
             </w:r>
           </w:p>
         </w:tc>
@@ -6998,7 +9242,7 @@
           <w:color w:val="556274"/>
           <w:sz w:val="18"/>
         </w:rPr>
-        <w:t>WCAG 2.2 · Labrecque &amp; Milne 2012 · Gibbons 2018</w:t>
+        <w:t>WCAG 2.2 · Labrecque &amp; Milne 2012 · Gibbons 2018 · WHO 2019 · Mehta &amp; Zhu 2009 · Frost 2016</w:t>
       </w:r>
     </w:p>
     <w:p>
@@ -7112,7 +9356,7 @@
             </w:r>
             <w:r>
               <w:rPr/>
-              <w:t xml:space="preserve"> The four boxes at the top are the parts of a decision, filled in for Kettle &amp; Co. The two boxes below are the rule for future decisions.</w:t>
+              <w:t xml:space="preserve"> The four boxes at the top are the parts of a decision, filled in for Kettle &amp; Co. The two boxes below are the rule for future decisions. A table of a real case and a real rule follows.</w:t>
             </w:r>
           </w:p>
         </w:tc>
@@ -7438,6 +9682,266 @@
         <w:spacing w:before="0" w:after="80"/>
       </w:pPr>
     </w:p>
+    <w:p>
+      <w:pPr>
+        <w:spacing w:before="0" w:after="100"/>
+      </w:pPr>
+      <w:r>
+        <w:rPr>
+          <w:b/>
+        </w:rPr>
+        <w:t>Who owns visual standards: a real case and a real rule</w:t>
+      </w:r>
+    </w:p>
+    <w:tbl>
+      <w:tblPr>
+        <w:tblW w:w="9638" w:type="dxa"/>
+        <w:tblBorders>
+          <w:top w:val="single" w:sz="4" w:space="0" w:color="D5DEE9"/>
+          <w:left w:val="single" w:sz="4" w:space="0" w:color="D5DEE9"/>
+          <w:bottom w:val="single" w:sz="4" w:space="0" w:color="D5DEE9"/>
+          <w:right w:val="single" w:sz="4" w:space="0" w:color="D5DEE9"/>
+          <w:insideH w:val="single" w:sz="4" w:space="0" w:color="D5DEE9"/>
+          <w:insideV w:val="single" w:sz="4" w:space="0" w:color="D5DEE9"/>
+        </w:tblBorders>
+        <w:tblLayout w:type="fixed"/>
+        <w:tblCellMar>
+          <w:top w:w="60" w:type="dxa"/>
+          <w:left w:w="100" w:type="dxa"/>
+          <w:bottom w:w="60" w:type="dxa"/>
+          <w:right w:w="100" w:type="dxa"/>
+        </w:tblCellMar>
+      </w:tblPr>
+      <w:tblGrid>
+        <w:gridCol w:w="1709"/>
+        <w:gridCol w:w="4221"/>
+        <w:gridCol w:w="3708"/>
+      </w:tblGrid>
+      <w:tr>
+        <w:trPr>
+          <w:cantSplit/>
+          <w:tblHeader/>
+        </w:trPr>
+        <w:tc>
+          <w:tcPr>
+            <w:tcW w:type="dxa" w:w="1709"/>
+            <w:shd w:val="clear" w:color="auto" w:fill="E6ECF4"/>
+          </w:tcPr>
+          <w:p>
+            <w:pPr>
+              <w:spacing w:before="0" w:after="0"/>
+            </w:pPr>
+            <w:r>
+              <w:rPr>
+                <w:b/>
+                <w:sz w:val="20"/>
+              </w:rPr>
+              <w:t>Part</w:t>
+            </w:r>
+          </w:p>
+        </w:tc>
+        <w:tc>
+          <w:tcPr>
+            <w:tcW w:type="dxa" w:w="4221"/>
+            <w:shd w:val="clear" w:color="auto" w:fill="E6ECF4"/>
+          </w:tcPr>
+          <w:p>
+            <w:pPr>
+              <w:spacing w:before="0" w:after="0"/>
+            </w:pPr>
+            <w:r>
+              <w:rPr>
+                <w:b/>
+                <w:sz w:val="20"/>
+              </w:rPr>
+              <w:t>Real example</w:t>
+            </w:r>
+          </w:p>
+        </w:tc>
+        <w:tc>
+          <w:tcPr>
+            <w:tcW w:type="dxa" w:w="3708"/>
+            <w:shd w:val="clear" w:color="auto" w:fill="E6ECF4"/>
+          </w:tcPr>
+          <w:p>
+            <w:pPr>
+              <w:spacing w:before="0" w:after="0"/>
+            </w:pPr>
+            <w:r>
+              <w:rPr>
+                <w:b/>
+                <w:sz w:val="20"/>
+              </w:rPr>
+              <w:t>What it means</w:t>
+            </w:r>
+          </w:p>
+        </w:tc>
+      </w:tr>
+      <w:tr>
+        <w:trPr>
+          <w:cantSplit/>
+        </w:trPr>
+        <w:tc>
+          <w:tcPr>
+            <w:tcW w:type="dxa" w:w="1709"/>
+          </w:tcPr>
+          <w:p>
+            <w:pPr>
+              <w:spacing w:before="0" w:after="0"/>
+            </w:pPr>
+            <w:r>
+              <w:rPr>
+                <w:sz w:val="20"/>
+              </w:rPr>
+              <w:t>Taste or data</w:t>
+            </w:r>
+          </w:p>
+        </w:tc>
+        <w:tc>
+          <w:tcPr>
+            <w:tcW w:type="dxa" w:w="4221"/>
+          </w:tcPr>
+          <w:p>
+            <w:pPr>
+              <w:spacing w:before="0" w:after="0"/>
+            </w:pPr>
+            <w:r>
+              <w:rPr>
+                <w:sz w:val="20"/>
+              </w:rPr>
+              <w:t>In the Google case the colour of links was settled by testing 41 shades, and the designer who objected left (Bowman 2009).</w:t>
+            </w:r>
+          </w:p>
+        </w:tc>
+        <w:tc>
+          <w:tcPr>
+            <w:tcW w:type="dxa" w:w="3708"/>
+          </w:tcPr>
+          <w:p>
+            <w:pPr>
+              <w:spacing w:before="0" w:after="0"/>
+            </w:pPr>
+            <w:r>
+              <w:rPr>
+                <w:sz w:val="20"/>
+              </w:rPr>
+              <w:t>Decide in advance what is settled by evidence, what by a rule and what by a person.</w:t>
+            </w:r>
+          </w:p>
+        </w:tc>
+      </w:tr>
+      <w:tr>
+        <w:trPr>
+          <w:cantSplit/>
+        </w:trPr>
+        <w:tc>
+          <w:tcPr>
+            <w:tcW w:type="dxa" w:w="1709"/>
+          </w:tcPr>
+          <w:p>
+            <w:pPr>
+              <w:spacing w:before="0" w:after="0"/>
+            </w:pPr>
+            <w:r>
+              <w:rPr>
+                <w:sz w:val="20"/>
+              </w:rPr>
+              <w:t>A rule owner</w:t>
+            </w:r>
+          </w:p>
+        </w:tc>
+        <w:tc>
+          <w:tcPr>
+            <w:tcW w:type="dxa" w:w="4221"/>
+          </w:tcPr>
+          <w:p>
+            <w:pPr>
+              <w:spacing w:before="0" w:after="0"/>
+            </w:pPr>
+            <w:r>
+              <w:rPr>
+                <w:sz w:val="20"/>
+              </w:rPr>
+              <w:t>A platform owner such as Apple publishes text styles and minimum sizes that every app is expected to follow.</w:t>
+            </w:r>
+          </w:p>
+        </w:tc>
+        <w:tc>
+          <w:tcPr>
+            <w:tcW w:type="dxa" w:w="3708"/>
+          </w:tcPr>
+          <w:p>
+            <w:pPr>
+              <w:spacing w:before="0" w:after="0"/>
+            </w:pPr>
+            <w:r>
+              <w:rPr>
+                <w:sz w:val="20"/>
+              </w:rPr>
+              <w:t>Someone must own the rules and the components, with the power to say no.</w:t>
+            </w:r>
+          </w:p>
+        </w:tc>
+      </w:tr>
+      <w:tr>
+        <w:trPr>
+          <w:cantSplit/>
+        </w:trPr>
+        <w:tc>
+          <w:tcPr>
+            <w:tcW w:type="dxa" w:w="1709"/>
+          </w:tcPr>
+          <w:p>
+            <w:pPr>
+              <w:spacing w:before="0" w:after="0"/>
+            </w:pPr>
+            <w:r>
+              <w:rPr>
+                <w:sz w:val="20"/>
+              </w:rPr>
+              <w:t>Incomplete data</w:t>
+            </w:r>
+          </w:p>
+        </w:tc>
+        <w:tc>
+          <w:tcPr>
+            <w:tcW w:type="dxa" w:w="4221"/>
+          </w:tcPr>
+          <w:p>
+            <w:pPr>
+              <w:spacing w:before="0" w:after="0"/>
+            </w:pPr>
+            <w:r>
+              <w:rPr>
+                <w:sz w:val="20"/>
+              </w:rPr>
+              <w:t>WCAG gives thresholds that hold before any test with your own users.</w:t>
+            </w:r>
+          </w:p>
+        </w:tc>
+        <w:tc>
+          <w:tcPr>
+            <w:tcW w:type="dxa" w:w="3708"/>
+          </w:tcPr>
+          <w:p>
+            <w:pPr>
+              <w:spacing w:before="0" w:after="0"/>
+            </w:pPr>
+            <w:r>
+              <w:rPr>
+                <w:sz w:val="20"/>
+              </w:rPr>
+              <w:t>Where data is missing, decide on the standard and say what a test would change.</w:t>
+            </w:r>
+          </w:p>
+        </w:tc>
+      </w:tr>
+    </w:tbl>
+    <w:p>
+      <w:pPr>
+        <w:spacing w:before="0" w:after="80"/>
+      </w:pPr>
+    </w:p>
     <w:tbl>
       <w:tblPr>
         <w:tblW w:w="9598" w:type="dxa"/>
@@ -7487,7 +9991,7 @@
             </w:pPr>
             <w:r>
               <w:rPr/>
-              <w:t>Kettle &amp; Co, Rosa, Theo, Ines and Karim are made up for this example. Deciding with limited information follows Simon (1956); the premortem follows Klein (2007).</w:t>
+              <w:t>Kettle &amp; Co, Rosa, Theo, Ines and Karim are made up for this example. Deciding with limited information follows Simon (1956); the premortem follows Klein (2007). The findings in the table of real evidence are real research results, rules and cases; the sources are listed below.</w:t>
             </w:r>
           </w:p>
         </w:tc>
@@ -7666,7 +10170,7 @@
           <w:color w:val="556274"/>
           <w:sz w:val="18"/>
         </w:rPr>
-        <w:t>Simon 1956 · Klein 2007 · WCAG 2.2</w:t>
+        <w:t>Simon 1956 · Klein 2007 · WCAG 2.2 · Bowman 2009 · Apple HIG</w:t>
       </w:r>
     </w:p>
     <w:p>
@@ -8363,6 +10867,42 @@
         <w:rPr>
           <w:sz w:val="19"/>
         </w:rPr>
+        <w:t>Itti, L., &amp; Koch, C. (2001). Computational modelling of visual attention. Nature Reviews Neuroscience, 2(3), 194–203. (Attention is pulled by what differs from its surroundings in colour, contrast, orientation and movement: the bottom-up side of seeing.)</w:t>
+      </w:r>
+    </w:p>
+    <w:p>
+      <w:pPr>
+        <w:spacing w:before="0" w:after="80"/>
+        <w:ind w:left="283" w:hanging="283"/>
+      </w:pPr>
+      <w:r>
+        <w:rPr>
+          <w:sz w:val="19"/>
+        </w:rPr>
+        <w:t>Madden, T. J., Hewett, K., &amp; Roth, M. S. (2000). Managing images in different cultures: A cross-national study of color meanings and preferences. Journal of International Marketing, 8(4), 90–107. (In eight countries, colour meanings and preferences showed both similarities and differences, so a colour code has to be checked with each target group.)</w:t>
+      </w:r>
+    </w:p>
+    <w:p>
+      <w:pPr>
+        <w:spacing w:before="0" w:after="80"/>
+        <w:ind w:left="283" w:hanging="283"/>
+      </w:pPr>
+      <w:r>
+        <w:rPr>
+          <w:sz w:val="19"/>
+        </w:rPr>
+        <w:t>Gnambs, T. (2020). Limited evidence for the effect of red color on cognitive performance: A meta-analysis. Psychonomic Bulletin &amp; Review, 27. https://doi.org/10.3758/s13423-020-01772-1 (After a correction for publication bias, no evidential value for an effect of red on intellectual performance: a caution against claims that a colour changes behaviour.)</w:t>
+      </w:r>
+    </w:p>
+    <w:p>
+      <w:pPr>
+        <w:spacing w:before="0" w:after="80"/>
+        <w:ind w:left="283" w:hanging="283"/>
+      </w:pPr>
+      <w:r>
+        <w:rPr>
+          <w:sz w:val="19"/>
+        </w:rPr>
         <w:t>W3C (2023). Web Content Accessibility Guidelines (WCAG) 2.2. https://www.w3.org/TR/WCAG22/ (Success criterion 1.4.1 Use of Color: colour must not be the only way to convey information; 1.4.3 Contrast (Minimum) for text.)</w:t>
       </w:r>
     </w:p>
@@ -8376,6 +10916,30 @@
           <w:sz w:val="19"/>
         </w:rPr>
         <w:t>Nielsen, J. (1994, reviewed 2024). 10 Usability Heuristics for User Interface Design. Nielsen Norman Group. https://www.nngroup.com/articles/ten-usability-heuristics/ (Visibility of system status, consistency and standards, recognition rather than recall, aesthetic and minimalist design.)</w:t>
+      </w:r>
+    </w:p>
+    <w:p>
+      <w:pPr>
+        <w:spacing w:before="0" w:after="80"/>
+        <w:ind w:left="283" w:hanging="283"/>
+      </w:pPr>
+      <w:r>
+        <w:rPr>
+          <w:sz w:val="19"/>
+        </w:rPr>
+        <w:t>Wong, B. (2011). Color blindness. Nature Methods, 8(6), 441. (About 8% of men and under 1% of women have a colour vision deficiency, so colour alone must not carry a meaning.)</w:t>
+      </w:r>
+    </w:p>
+    <w:p>
+      <w:pPr>
+        <w:spacing w:before="0" w:after="80"/>
+        <w:ind w:left="283" w:hanging="283"/>
+      </w:pPr>
+      <w:r>
+        <w:rPr>
+          <w:sz w:val="19"/>
+        </w:rPr>
+        <w:t>Bowman, D. (2009). Goodbye, Google. stopdesign.com, 20 March 2009. https://stopdesign.com/archive/2009/03/20/goodbye-google.html (The designer's account of leaving Google after a test of 41 shades of blue, and of a process that settles design decisions by data alone.)</w:t>
       </w:r>
     </w:p>
     <w:p>
@@ -8423,6 +10987,42 @@
         <w:rPr>
           <w:sz w:val="19"/>
         </w:rPr>
+        <w:t>Dyson, M. C., &amp; Haselgrove, M. (2001). The influence of reading speed and line length on the effectiveness of reading from screen. International Journal of Human-Computer Studies, 54(4), 585–612. (Comprehension was highest at a medium line length of about 55 characters; the figure is from summaries of the paper, check the original.)</w:t>
+      </w:r>
+    </w:p>
+    <w:p>
+      <w:pPr>
+        <w:spacing w:before="0" w:after="80"/>
+        <w:ind w:left="283" w:hanging="283"/>
+      </w:pPr>
+      <w:r>
+        <w:rPr>
+          <w:sz w:val="19"/>
+        </w:rPr>
+        <w:t>World Health Organization (2019). World report on vision. Geneva: WHO. https://www.who.int/publications/i/item/9789241516570 (At least 2.2 billion people have a vision impairment or blindness; about 1 billion of these cases could have been prevented or have not yet been addressed.)</w:t>
+      </w:r>
+    </w:p>
+    <w:p>
+      <w:pPr>
+        <w:spacing w:before="0" w:after="80"/>
+        <w:ind w:left="283" w:hanging="283"/>
+      </w:pPr>
+      <w:r>
+        <w:rPr>
+          <w:sz w:val="19"/>
+        </w:rPr>
+        <w:t>Apple (current). Human Interface Guidelines: Typography. https://developer.apple.com/design/human-interface-guidelines/typography (Named text styles for roles such as title and body, Dynamic Type that lets people choose their text size, and a default size of 17 points and a minimum of 11 points on iOS; check the current page.)</w:t>
+      </w:r>
+    </w:p>
+    <w:p>
+      <w:pPr>
+        <w:spacing w:before="0" w:after="80"/>
+        <w:ind w:left="283" w:hanging="283"/>
+      </w:pPr>
+      <w:r>
+        <w:rPr>
+          <w:sz w:val="19"/>
+        </w:rPr>
         <w:t>Bringhurst, R. (2004). The Elements of Typographic Style (3rd ed.). Hartley &amp; Marks. (Typography exists to serve the text and the reader; hierarchy, measure and spacing are its tools.)</w:t>
       </w:r>
     </w:p>
@@ -8447,7 +11047,55 @@
         <w:rPr>
           <w:sz w:val="19"/>
         </w:rPr>
+        <w:t>Nielsen, J. (1997). How Users Read on the Web. Nielsen Norman Group. https://www.nngroup.com/articles/how-users-read-on-the-web/ (Most users scan a page rather than read it word by word, picking out words, headings and links.)</w:t>
+      </w:r>
+    </w:p>
+    <w:p>
+      <w:pPr>
+        <w:spacing w:before="0" w:after="80"/>
+        <w:ind w:left="283" w:hanging="283"/>
+      </w:pPr>
+      <w:r>
+        <w:rPr>
+          <w:sz w:val="19"/>
+        </w:rPr>
+        <w:t>WebAIM (2024). Screen Reader User Survey #10. https://webaim.org/projects/screenreadersurvey10/ (71.6% of the respondents said they would first navigate by headings to find information on a long page; the sample is not random.)</w:t>
+      </w:r>
+    </w:p>
+    <w:p>
+      <w:pPr>
+        <w:spacing w:before="0" w:after="80"/>
+        <w:ind w:left="283" w:hanging="283"/>
+      </w:pPr>
+      <w:r>
+        <w:rPr>
+          <w:sz w:val="19"/>
+        </w:rPr>
         <w:t>Gibbons, S. (2018). Using Prioritization Matrices to Inform UX Decisions. Nielsen Norman Group. https://www.nngroup.com/articles/prioritization-matrices/ (Rate each option on the same few criteria, such as value to the user against effort, and put the reason next to each rating.)</w:t>
+      </w:r>
+    </w:p>
+    <w:p>
+      <w:pPr>
+        <w:spacing w:before="0" w:after="80"/>
+        <w:ind w:left="283" w:hanging="283"/>
+      </w:pPr>
+      <w:r>
+        <w:rPr>
+          <w:sz w:val="19"/>
+        </w:rPr>
+        <w:t>Sillence, E., Briggs, P., Fishwick, L., &amp; Harris, P. (2004). Trust and mistrust of online health sites. Proceedings of CHI 2004, 663–670. (Fifteen women searched for health advice over four weeks: design appeal predicted the rejection of a site, credibility of the information and personalisation predicted its selection.)</w:t>
+      </w:r>
+    </w:p>
+    <w:p>
+      <w:pPr>
+        <w:spacing w:before="0" w:after="80"/>
+        <w:ind w:left="283" w:hanging="283"/>
+      </w:pPr>
+      <w:r>
+        <w:rPr>
+          <w:sz w:val="19"/>
+        </w:rPr>
+        <w:t>Fogg, B. J., Soohoo, C., Danielson, D. R., Marable, L., Stanford, J., &amp; Tauber, E. R. (2003). How do users evaluate the credibility of Web sites? A study with over 2,500 participants. Proceedings of DUX '03. (2,684 people judged the credibility of 100 live sites; the design look was the factor mentioned most often, in 46.1% of their comments.)</w:t>
       </w:r>
     </w:p>
     <w:p>
@@ -8532,9 +11180,9 @@
         </w:tblCellMar>
       </w:tblPr>
       <w:tblGrid>
-        <w:gridCol w:w="1965"/>
-        <w:gridCol w:w="5417"/>
-        <w:gridCol w:w="1347"/>
+        <w:gridCol w:w="1959"/>
+        <w:gridCol w:w="5428"/>
+        <w:gridCol w:w="1342"/>
         <w:gridCol w:w="909"/>
       </w:tblGrid>
       <w:tr>
@@ -8544,7 +11192,7 @@
         </w:trPr>
         <w:tc>
           <w:tcPr>
-            <w:tcW w:type="dxa" w:w="1965"/>
+            <w:tcW w:type="dxa" w:w="1959"/>
             <w:shd w:val="clear" w:color="auto" w:fill="E6ECF4"/>
           </w:tcPr>
           <w:p>
@@ -8562,7 +11210,7 @@
         </w:tc>
         <w:tc>
           <w:tcPr>
-            <w:tcW w:type="dxa" w:w="5417"/>
+            <w:tcW w:type="dxa" w:w="5428"/>
             <w:shd w:val="clear" w:color="auto" w:fill="E6ECF4"/>
           </w:tcPr>
           <w:p>
@@ -8580,7 +11228,7 @@
         </w:tc>
         <w:tc>
           <w:tcPr>
-            <w:tcW w:type="dxa" w:w="1347"/>
+            <w:tcW w:type="dxa" w:w="1342"/>
             <w:shd w:val="clear" w:color="auto" w:fill="E6ECF4"/>
           </w:tcPr>
           <w:p>
@@ -8621,7 +11269,7 @@
         </w:trPr>
         <w:tc>
           <w:tcPr>
-            <w:tcW w:type="dxa" w:w="1965"/>
+            <w:tcW w:type="dxa" w:w="1959"/>
           </w:tcPr>
           <w:p>
             <w:pPr>
@@ -8638,7 +11286,7 @@
         </w:tc>
         <w:tc>
           <w:tcPr>
-            <w:tcW w:type="dxa" w:w="5417"/>
+            <w:tcW w:type="dxa" w:w="5428"/>
           </w:tcPr>
           <w:p>
             <w:pPr>
@@ -8654,7 +11302,7 @@
         </w:tc>
         <w:tc>
           <w:tcPr>
-            <w:tcW w:type="dxa" w:w="1347"/>
+            <w:tcW w:type="dxa" w:w="1342"/>
           </w:tcPr>
           <w:p>
             <w:pPr>
@@ -8691,7 +11339,7 @@
         </w:trPr>
         <w:tc>
           <w:tcPr>
-            <w:tcW w:type="dxa" w:w="1965"/>
+            <w:tcW w:type="dxa" w:w="1959"/>
           </w:tcPr>
           <w:p>
             <w:pPr>
@@ -8708,7 +11356,7 @@
         </w:tc>
         <w:tc>
           <w:tcPr>
-            <w:tcW w:type="dxa" w:w="5417"/>
+            <w:tcW w:type="dxa" w:w="5428"/>
           </w:tcPr>
           <w:p>
             <w:pPr>
@@ -8724,7 +11372,7 @@
         </w:tc>
         <w:tc>
           <w:tcPr>
-            <w:tcW w:type="dxa" w:w="1347"/>
+            <w:tcW w:type="dxa" w:w="1342"/>
           </w:tcPr>
           <w:p>
             <w:pPr>
@@ -8761,7 +11409,7 @@
         </w:trPr>
         <w:tc>
           <w:tcPr>
-            <w:tcW w:type="dxa" w:w="1965"/>
+            <w:tcW w:type="dxa" w:w="1959"/>
           </w:tcPr>
           <w:p>
             <w:pPr>
@@ -8778,7 +11426,7 @@
         </w:tc>
         <w:tc>
           <w:tcPr>
-            <w:tcW w:type="dxa" w:w="5417"/>
+            <w:tcW w:type="dxa" w:w="5428"/>
           </w:tcPr>
           <w:p>
             <w:pPr>
@@ -8794,7 +11442,7 @@
         </w:tc>
         <w:tc>
           <w:tcPr>
-            <w:tcW w:type="dxa" w:w="1347"/>
+            <w:tcW w:type="dxa" w:w="1342"/>
           </w:tcPr>
           <w:p>
             <w:pPr>
@@ -8831,7 +11479,7 @@
         </w:trPr>
         <w:tc>
           <w:tcPr>
-            <w:tcW w:type="dxa" w:w="1965"/>
+            <w:tcW w:type="dxa" w:w="1959"/>
           </w:tcPr>
           <w:p>
             <w:pPr>
@@ -8848,7 +11496,7 @@
         </w:tc>
         <w:tc>
           <w:tcPr>
-            <w:tcW w:type="dxa" w:w="5417"/>
+            <w:tcW w:type="dxa" w:w="5428"/>
           </w:tcPr>
           <w:p>
             <w:pPr>
@@ -8864,7 +11512,7 @@
         </w:tc>
         <w:tc>
           <w:tcPr>
-            <w:tcW w:type="dxa" w:w="1347"/>
+            <w:tcW w:type="dxa" w:w="1342"/>
           </w:tcPr>
           <w:p>
             <w:pPr>
@@ -8901,7 +11549,7 @@
         </w:trPr>
         <w:tc>
           <w:tcPr>
-            <w:tcW w:type="dxa" w:w="1965"/>
+            <w:tcW w:type="dxa" w:w="1959"/>
           </w:tcPr>
           <w:p>
             <w:pPr>
@@ -8918,7 +11566,7 @@
         </w:tc>
         <w:tc>
           <w:tcPr>
-            <w:tcW w:type="dxa" w:w="5417"/>
+            <w:tcW w:type="dxa" w:w="5428"/>
           </w:tcPr>
           <w:p>
             <w:pPr>
@@ -8934,7 +11582,7 @@
         </w:tc>
         <w:tc>
           <w:tcPr>
-            <w:tcW w:type="dxa" w:w="1347"/>
+            <w:tcW w:type="dxa" w:w="1342"/>
           </w:tcPr>
           <w:p>
             <w:pPr>
@@ -8971,7 +11619,7 @@
         </w:trPr>
         <w:tc>
           <w:tcPr>
-            <w:tcW w:type="dxa" w:w="1965"/>
+            <w:tcW w:type="dxa" w:w="1959"/>
           </w:tcPr>
           <w:p>
             <w:pPr>
@@ -8988,7 +11636,7 @@
         </w:tc>
         <w:tc>
           <w:tcPr>
-            <w:tcW w:type="dxa" w:w="5417"/>
+            <w:tcW w:type="dxa" w:w="5428"/>
           </w:tcPr>
           <w:p>
             <w:pPr>
@@ -9004,7 +11652,7 @@
         </w:tc>
         <w:tc>
           <w:tcPr>
-            <w:tcW w:type="dxa" w:w="1347"/>
+            <w:tcW w:type="dxa" w:w="1342"/>
           </w:tcPr>
           <w:p>
             <w:pPr>
@@ -9041,7 +11689,7 @@
         </w:trPr>
         <w:tc>
           <w:tcPr>
-            <w:tcW w:type="dxa" w:w="1965"/>
+            <w:tcW w:type="dxa" w:w="1959"/>
           </w:tcPr>
           <w:p>
             <w:pPr>
@@ -9058,7 +11706,7 @@
         </w:tc>
         <w:tc>
           <w:tcPr>
-            <w:tcW w:type="dxa" w:w="5417"/>
+            <w:tcW w:type="dxa" w:w="5428"/>
           </w:tcPr>
           <w:p>
             <w:pPr>
@@ -9074,7 +11722,7 @@
         </w:tc>
         <w:tc>
           <w:tcPr>
-            <w:tcW w:type="dxa" w:w="1347"/>
+            <w:tcW w:type="dxa" w:w="1342"/>
           </w:tcPr>
           <w:p>
             <w:pPr>
@@ -9111,7 +11759,7 @@
         </w:trPr>
         <w:tc>
           <w:tcPr>
-            <w:tcW w:type="dxa" w:w="1965"/>
+            <w:tcW w:type="dxa" w:w="1959"/>
           </w:tcPr>
           <w:p>
             <w:pPr>
@@ -9128,7 +11776,7 @@
         </w:tc>
         <w:tc>
           <w:tcPr>
-            <w:tcW w:type="dxa" w:w="5417"/>
+            <w:tcW w:type="dxa" w:w="5428"/>
           </w:tcPr>
           <w:p>
             <w:pPr>
@@ -9144,7 +11792,7 @@
         </w:tc>
         <w:tc>
           <w:tcPr>
-            <w:tcW w:type="dxa" w:w="1347"/>
+            <w:tcW w:type="dxa" w:w="1342"/>
           </w:tcPr>
           <w:p>
             <w:pPr>
@@ -9181,7 +11829,7 @@
         </w:trPr>
         <w:tc>
           <w:tcPr>
-            <w:tcW w:type="dxa" w:w="1965"/>
+            <w:tcW w:type="dxa" w:w="1959"/>
           </w:tcPr>
           <w:p>
             <w:pPr>
@@ -9198,7 +11846,7 @@
         </w:tc>
         <w:tc>
           <w:tcPr>
-            <w:tcW w:type="dxa" w:w="5417"/>
+            <w:tcW w:type="dxa" w:w="5428"/>
           </w:tcPr>
           <w:p>
             <w:pPr>
@@ -9214,7 +11862,7 @@
         </w:tc>
         <w:tc>
           <w:tcPr>
-            <w:tcW w:type="dxa" w:w="1347"/>
+            <w:tcW w:type="dxa" w:w="1342"/>
           </w:tcPr>
           <w:p>
             <w:pPr>
@@ -9251,7 +11899,7 @@
         </w:trPr>
         <w:tc>
           <w:tcPr>
-            <w:tcW w:type="dxa" w:w="1965"/>
+            <w:tcW w:type="dxa" w:w="1959"/>
           </w:tcPr>
           <w:p>
             <w:pPr>
@@ -9268,7 +11916,7 @@
         </w:tc>
         <w:tc>
           <w:tcPr>
-            <w:tcW w:type="dxa" w:w="5417"/>
+            <w:tcW w:type="dxa" w:w="5428"/>
           </w:tcPr>
           <w:p>
             <w:pPr>
@@ -9284,7 +11932,7 @@
         </w:tc>
         <w:tc>
           <w:tcPr>
-            <w:tcW w:type="dxa" w:w="1347"/>
+            <w:tcW w:type="dxa" w:w="1342"/>
           </w:tcPr>
           <w:p>
             <w:pPr>
@@ -9321,7 +11969,7 @@
         </w:trPr>
         <w:tc>
           <w:tcPr>
-            <w:tcW w:type="dxa" w:w="1965"/>
+            <w:tcW w:type="dxa" w:w="1959"/>
           </w:tcPr>
           <w:p>
             <w:pPr>
@@ -9338,7 +11986,7 @@
         </w:tc>
         <w:tc>
           <w:tcPr>
-            <w:tcW w:type="dxa" w:w="5417"/>
+            <w:tcW w:type="dxa" w:w="5428"/>
           </w:tcPr>
           <w:p>
             <w:pPr>
@@ -9354,7 +12002,7 @@
         </w:tc>
         <w:tc>
           <w:tcPr>
-            <w:tcW w:type="dxa" w:w="1347"/>
+            <w:tcW w:type="dxa" w:w="1342"/>
           </w:tcPr>
           <w:p>
             <w:pPr>
@@ -9391,7 +12039,7 @@
         </w:trPr>
         <w:tc>
           <w:tcPr>
-            <w:tcW w:type="dxa" w:w="1965"/>
+            <w:tcW w:type="dxa" w:w="1959"/>
           </w:tcPr>
           <w:p>
             <w:pPr>
@@ -9408,7 +12056,7 @@
         </w:tc>
         <w:tc>
           <w:tcPr>
-            <w:tcW w:type="dxa" w:w="5417"/>
+            <w:tcW w:type="dxa" w:w="5428"/>
           </w:tcPr>
           <w:p>
             <w:pPr>
@@ -9424,7 +12072,7 @@
         </w:tc>
         <w:tc>
           <w:tcPr>
-            <w:tcW w:type="dxa" w:w="1347"/>
+            <w:tcW w:type="dxa" w:w="1342"/>
           </w:tcPr>
           <w:p>
             <w:pPr>
@@ -9461,7 +12109,7 @@
         </w:trPr>
         <w:tc>
           <w:tcPr>
-            <w:tcW w:type="dxa" w:w="1965"/>
+            <w:tcW w:type="dxa" w:w="1959"/>
           </w:tcPr>
           <w:p>
             <w:pPr>
@@ -9478,7 +12126,7 @@
         </w:tc>
         <w:tc>
           <w:tcPr>
-            <w:tcW w:type="dxa" w:w="5417"/>
+            <w:tcW w:type="dxa" w:w="5428"/>
           </w:tcPr>
           <w:p>
             <w:pPr>
@@ -9494,7 +12142,7 @@
         </w:tc>
         <w:tc>
           <w:tcPr>
-            <w:tcW w:type="dxa" w:w="1347"/>
+            <w:tcW w:type="dxa" w:w="1342"/>
           </w:tcPr>
           <w:p>
             <w:pPr>
@@ -9531,7 +12179,7 @@
         </w:trPr>
         <w:tc>
           <w:tcPr>
-            <w:tcW w:type="dxa" w:w="1965"/>
+            <w:tcW w:type="dxa" w:w="1959"/>
           </w:tcPr>
           <w:p>
             <w:pPr>
@@ -9542,13 +12190,13 @@
                 <w:b/>
                 <w:sz w:val="19"/>
               </w:rPr>
-              <w:t>Font weight</w:t>
-            </w:r>
-          </w:p>
-        </w:tc>
-        <w:tc>
-          <w:tcPr>
-            <w:tcW w:type="dxa" w:w="5417"/>
+              <w:t>F-pattern</w:t>
+            </w:r>
+          </w:p>
+        </w:tc>
+        <w:tc>
+          <w:tcPr>
+            <w:tcW w:type="dxa" w:w="5428"/>
           </w:tcPr>
           <w:p>
             <w:pPr>
@@ -9558,13 +12206,13 @@
               <w:rPr>
                 <w:sz w:val="19"/>
               </w:rPr>
-              <w:t>How thick the strokes of the letters are: thin, regular, bold. Thin strokes can vanish on a screen, above all at small sizes.</w:t>
-            </w:r>
-          </w:p>
-        </w:tc>
-        <w:tc>
-          <w:tcPr>
-            <w:tcW w:type="dxa" w:w="1347"/>
+              <w:t>A common way the eye scans a text-heavy page without structure: across the top, across a little lower, then down the left edge. Headings and short blocks break it up.</w:t>
+            </w:r>
+          </w:p>
+        </w:tc>
+        <w:tc>
+          <w:tcPr>
+            <w:tcW w:type="dxa" w:w="1342"/>
           </w:tcPr>
           <w:p>
             <w:pPr>
@@ -9590,7 +12238,7 @@
               <w:rPr>
                 <w:sz w:val="19"/>
               </w:rPr>
-              <w:t>Day 3</w:t>
+              <w:t>Day 2</w:t>
             </w:r>
           </w:p>
         </w:tc>
@@ -9601,7 +12249,7 @@
         </w:trPr>
         <w:tc>
           <w:tcPr>
-            <w:tcW w:type="dxa" w:w="1965"/>
+            <w:tcW w:type="dxa" w:w="1959"/>
           </w:tcPr>
           <w:p>
             <w:pPr>
@@ -9612,13 +12260,13 @@
                 <w:b/>
                 <w:sz w:val="19"/>
               </w:rPr>
-              <w:t>Functional colour</w:t>
-            </w:r>
-          </w:p>
-        </w:tc>
-        <w:tc>
-          <w:tcPr>
-            <w:tcW w:type="dxa" w:w="5417"/>
+              <w:t>Font weight</w:t>
+            </w:r>
+          </w:p>
+        </w:tc>
+        <w:tc>
+          <w:tcPr>
+            <w:tcW w:type="dxa" w:w="5428"/>
           </w:tcPr>
           <w:p>
             <w:pPr>
@@ -9628,13 +12276,13 @@
               <w:rPr>
                 <w:sz w:val="19"/>
               </w:rPr>
-              <w:t>Colour with a job: it tells people what can be done, what matters most or what state something is in. Each colour keeps one meaning everywhere.</w:t>
-            </w:r>
-          </w:p>
-        </w:tc>
-        <w:tc>
-          <w:tcPr>
-            <w:tcW w:type="dxa" w:w="1347"/>
+              <w:t>How thick the strokes of the letters are: thin, regular, bold. Thin strokes can vanish on a screen, above all at small sizes.</w:t>
+            </w:r>
+          </w:p>
+        </w:tc>
+        <w:tc>
+          <w:tcPr>
+            <w:tcW w:type="dxa" w:w="1342"/>
           </w:tcPr>
           <w:p>
             <w:pPr>
@@ -9671,7 +12319,7 @@
         </w:trPr>
         <w:tc>
           <w:tcPr>
-            <w:tcW w:type="dxa" w:w="1965"/>
+            <w:tcW w:type="dxa" w:w="1959"/>
           </w:tcPr>
           <w:p>
             <w:pPr>
@@ -9682,13 +12330,13 @@
                 <w:b/>
                 <w:sz w:val="19"/>
               </w:rPr>
-              <w:t>Governance</w:t>
-            </w:r>
-          </w:p>
-        </w:tc>
-        <w:tc>
-          <w:tcPr>
-            <w:tcW w:type="dxa" w:w="5417"/>
+              <w:t>Functional colour</w:t>
+            </w:r>
+          </w:p>
+        </w:tc>
+        <w:tc>
+          <w:tcPr>
+            <w:tcW w:type="dxa" w:w="5428"/>
           </w:tcPr>
           <w:p>
             <w:pPr>
@@ -9698,13 +12346,13 @@
               <w:rPr>
                 <w:sz w:val="19"/>
               </w:rPr>
-              <w:t>The rules about who may decide what, who is answerable for it and how disagreements are settled.</w:t>
-            </w:r>
-          </w:p>
-        </w:tc>
-        <w:tc>
-          <w:tcPr>
-            <w:tcW w:type="dxa" w:w="1347"/>
+              <w:t>Colour with a job: it tells people what can be done, what matters most or what state something is in. Each colour keeps one meaning everywhere.</w:t>
+            </w:r>
+          </w:p>
+        </w:tc>
+        <w:tc>
+          <w:tcPr>
+            <w:tcW w:type="dxa" w:w="1342"/>
           </w:tcPr>
           <w:p>
             <w:pPr>
@@ -9730,7 +12378,7 @@
               <w:rPr>
                 <w:sz w:val="19"/>
               </w:rPr>
-              <w:t>Day 1</w:t>
+              <w:t>Day 3</w:t>
             </w:r>
           </w:p>
         </w:tc>
@@ -9741,7 +12389,7 @@
         </w:trPr>
         <w:tc>
           <w:tcPr>
-            <w:tcW w:type="dxa" w:w="1965"/>
+            <w:tcW w:type="dxa" w:w="1959"/>
           </w:tcPr>
           <w:p>
             <w:pPr>
@@ -9752,13 +12400,13 @@
                 <w:b/>
                 <w:sz w:val="19"/>
               </w:rPr>
-              <w:t>Grouping</w:t>
-            </w:r>
-          </w:p>
-        </w:tc>
-        <w:tc>
-          <w:tcPr>
-            <w:tcW w:type="dxa" w:w="5417"/>
+              <w:t>Governance</w:t>
+            </w:r>
+          </w:p>
+        </w:tc>
+        <w:tc>
+          <w:tcPr>
+            <w:tcW w:type="dxa" w:w="5428"/>
           </w:tcPr>
           <w:p>
             <w:pPr>
@@ -9768,13 +12416,13 @@
               <w:rPr>
                 <w:sz w:val="19"/>
               </w:rPr>
-              <w:t>Showing what belongs together, for example by putting it close together or making it look alike. The eye reads a group as one unit.</w:t>
-            </w:r>
-          </w:p>
-        </w:tc>
-        <w:tc>
-          <w:tcPr>
-            <w:tcW w:type="dxa" w:w="1347"/>
+              <w:t>The rules about who may decide what, who is answerable for it and how disagreements are settled.</w:t>
+            </w:r>
+          </w:p>
+        </w:tc>
+        <w:tc>
+          <w:tcPr>
+            <w:tcW w:type="dxa" w:w="1342"/>
           </w:tcPr>
           <w:p>
             <w:pPr>
@@ -9800,7 +12448,7 @@
               <w:rPr>
                 <w:sz w:val="19"/>
               </w:rPr>
-              <w:t>Day 2</w:t>
+              <w:t>Day 1</w:t>
             </w:r>
           </w:p>
         </w:tc>
@@ -9811,7 +12459,7 @@
         </w:trPr>
         <w:tc>
           <w:tcPr>
-            <w:tcW w:type="dxa" w:w="1965"/>
+            <w:tcW w:type="dxa" w:w="1959"/>
           </w:tcPr>
           <w:p>
             <w:pPr>
@@ -9822,13 +12470,13 @@
                 <w:b/>
                 <w:sz w:val="19"/>
               </w:rPr>
-              <w:t>Hypothesis</w:t>
-            </w:r>
-          </w:p>
-        </w:tc>
-        <w:tc>
-          <w:tcPr>
-            <w:tcW w:type="dxa" w:w="5417"/>
+              <w:t>Grouping</w:t>
+            </w:r>
+          </w:p>
+        </w:tc>
+        <w:tc>
+          <w:tcPr>
+            <w:tcW w:type="dxa" w:w="5428"/>
           </w:tcPr>
           <w:p>
             <w:pPr>
@@ -9838,13 +12486,13 @@
               <w:rPr>
                 <w:sz w:val="19"/>
               </w:rPr>
-              <w:t>An assumption you could check later. “This red banner could make users uneasy” is a hypothesis; “this banner is bad” is only an opinion.</w:t>
-            </w:r>
-          </w:p>
-        </w:tc>
-        <w:tc>
-          <w:tcPr>
-            <w:tcW w:type="dxa" w:w="1347"/>
+              <w:t>Showing what belongs together, for example by putting it close together or making it look alike. The eye reads a group as one unit.</w:t>
+            </w:r>
+          </w:p>
+        </w:tc>
+        <w:tc>
+          <w:tcPr>
+            <w:tcW w:type="dxa" w:w="1342"/>
           </w:tcPr>
           <w:p>
             <w:pPr>
@@ -9870,7 +12518,7 @@
               <w:rPr>
                 <w:sz w:val="19"/>
               </w:rPr>
-              <w:t>Day 1</w:t>
+              <w:t>Day 2</w:t>
             </w:r>
           </w:p>
         </w:tc>
@@ -9881,7 +12529,7 @@
         </w:trPr>
         <w:tc>
           <w:tcPr>
-            <w:tcW w:type="dxa" w:w="1965"/>
+            <w:tcW w:type="dxa" w:w="1959"/>
           </w:tcPr>
           <w:p>
             <w:pPr>
@@ -9892,13 +12540,13 @@
                 <w:b/>
                 <w:sz w:val="19"/>
               </w:rPr>
-              <w:t>Legibility</w:t>
-            </w:r>
-          </w:p>
-        </w:tc>
-        <w:tc>
-          <w:tcPr>
-            <w:tcW w:type="dxa" w:w="5417"/>
+              <w:t>Hypothesis</w:t>
+            </w:r>
+          </w:p>
+        </w:tc>
+        <w:tc>
+          <w:tcPr>
+            <w:tcW w:type="dxa" w:w="5428"/>
           </w:tcPr>
           <w:p>
             <w:pPr>
@@ -9908,13 +12556,13 @@
               <w:rPr>
                 <w:sz w:val="19"/>
               </w:rPr>
-              <w:t>How easily single letters and words can be told apart. Thin, decorative or very small type is less legible.</w:t>
-            </w:r>
-          </w:p>
-        </w:tc>
-        <w:tc>
-          <w:tcPr>
-            <w:tcW w:type="dxa" w:w="1347"/>
+              <w:t>An assumption you could check later. “This red banner could make users uneasy” is a hypothesis; “this banner is bad” is only an opinion.</w:t>
+            </w:r>
+          </w:p>
+        </w:tc>
+        <w:tc>
+          <w:tcPr>
+            <w:tcW w:type="dxa" w:w="1342"/>
           </w:tcPr>
           <w:p>
             <w:pPr>
@@ -9940,7 +12588,7 @@
               <w:rPr>
                 <w:sz w:val="19"/>
               </w:rPr>
-              <w:t>Day 3</w:t>
+              <w:t>Day 1</w:t>
             </w:r>
           </w:p>
         </w:tc>
@@ -9951,7 +12599,7 @@
         </w:trPr>
         <w:tc>
           <w:tcPr>
-            <w:tcW w:type="dxa" w:w="1965"/>
+            <w:tcW w:type="dxa" w:w="1959"/>
           </w:tcPr>
           <w:p>
             <w:pPr>
@@ -9962,13 +12610,13 @@
                 <w:b/>
                 <w:sz w:val="19"/>
               </w:rPr>
-              <w:t>Line spacing</w:t>
-            </w:r>
-          </w:p>
-        </w:tc>
-        <w:tc>
-          <w:tcPr>
-            <w:tcW w:type="dxa" w:w="5417"/>
+              <w:t>Legibility</w:t>
+            </w:r>
+          </w:p>
+        </w:tc>
+        <w:tc>
+          <w:tcPr>
+            <w:tcW w:type="dxa" w:w="5428"/>
           </w:tcPr>
           <w:p>
             <w:pPr>
@@ -9978,13 +12626,13 @@
               <w:rPr>
                 <w:sz w:val="19"/>
               </w:rPr>
-              <w:t>The space between lines of text. Too little and lines run together; enough and the eye finds the next line easily.</w:t>
-            </w:r>
-          </w:p>
-        </w:tc>
-        <w:tc>
-          <w:tcPr>
-            <w:tcW w:type="dxa" w:w="1347"/>
+              <w:t>How easily single letters and words can be told apart. Thin, decorative or very small type is less legible.</w:t>
+            </w:r>
+          </w:p>
+        </w:tc>
+        <w:tc>
+          <w:tcPr>
+            <w:tcW w:type="dxa" w:w="1342"/>
           </w:tcPr>
           <w:p>
             <w:pPr>
@@ -10021,7 +12669,7 @@
         </w:trPr>
         <w:tc>
           <w:tcPr>
-            <w:tcW w:type="dxa" w:w="1965"/>
+            <w:tcW w:type="dxa" w:w="1959"/>
           </w:tcPr>
           <w:p>
             <w:pPr>
@@ -10032,13 +12680,13 @@
                 <w:b/>
                 <w:sz w:val="19"/>
               </w:rPr>
-              <w:t>Neuro-UX</w:t>
-            </w:r>
-          </w:p>
-        </w:tc>
-        <w:tc>
-          <w:tcPr>
-            <w:tcW w:type="dxa" w:w="5417"/>
+              <w:t>Line spacing</w:t>
+            </w:r>
+          </w:p>
+        </w:tc>
+        <w:tc>
+          <w:tcPr>
+            <w:tcW w:type="dxa" w:w="5428"/>
           </w:tcPr>
           <w:p>
             <w:pPr>
@@ -10048,13 +12696,13 @@
               <w:rPr>
                 <w:sz w:val="19"/>
               </w:rPr>
-              <w:t>Designing an interface with knowledge of how the brain sees, attends, feels and decides, so that the design steers these processes on purpose and responsibly.</w:t>
-            </w:r>
-          </w:p>
-        </w:tc>
-        <w:tc>
-          <w:tcPr>
-            <w:tcW w:type="dxa" w:w="1347"/>
+              <w:t>The space between lines of text. Too little and lines run together; enough and the eye finds the next line easily.</w:t>
+            </w:r>
+          </w:p>
+        </w:tc>
+        <w:tc>
+          <w:tcPr>
+            <w:tcW w:type="dxa" w:w="1342"/>
           </w:tcPr>
           <w:p>
             <w:pPr>
@@ -10080,7 +12728,7 @@
               <w:rPr>
                 <w:sz w:val="19"/>
               </w:rPr>
-              <w:t>Day 1</w:t>
+              <w:t>Day 3</w:t>
             </w:r>
           </w:p>
         </w:tc>
@@ -10091,7 +12739,7 @@
         </w:trPr>
         <w:tc>
           <w:tcPr>
-            <w:tcW w:type="dxa" w:w="1965"/>
+            <w:tcW w:type="dxa" w:w="1959"/>
           </w:tcPr>
           <w:p>
             <w:pPr>
@@ -10102,13 +12750,13 @@
                 <w:b/>
                 <w:sz w:val="19"/>
               </w:rPr>
-              <w:t>Orientation</w:t>
-            </w:r>
-          </w:p>
-        </w:tc>
-        <w:tc>
-          <w:tcPr>
-            <w:tcW w:type="dxa" w:w="5417"/>
+              <w:t>Neuro-UX</w:t>
+            </w:r>
+          </w:p>
+        </w:tc>
+        <w:tc>
+          <w:tcPr>
+            <w:tcW w:type="dxa" w:w="5428"/>
           </w:tcPr>
           <w:p>
             <w:pPr>
@@ -10118,13 +12766,13 @@
               <w:rPr>
                 <w:sz w:val="19"/>
               </w:rPr>
-              <w:t>Knowing where you are, what you can do here and what happens next.</w:t>
-            </w:r>
-          </w:p>
-        </w:tc>
-        <w:tc>
-          <w:tcPr>
-            <w:tcW w:type="dxa" w:w="1347"/>
+              <w:t>Designing an interface with knowledge of how the brain sees, attends, feels and decides, so that the design steers these processes on purpose and responsibly.</w:t>
+            </w:r>
+          </w:p>
+        </w:tc>
+        <w:tc>
+          <w:tcPr>
+            <w:tcW w:type="dxa" w:w="1342"/>
           </w:tcPr>
           <w:p>
             <w:pPr>
@@ -10161,7 +12809,7 @@
         </w:trPr>
         <w:tc>
           <w:tcPr>
-            <w:tcW w:type="dxa" w:w="1965"/>
+            <w:tcW w:type="dxa" w:w="1959"/>
           </w:tcPr>
           <w:p>
             <w:pPr>
@@ -10172,13 +12820,13 @@
                 <w:b/>
                 <w:sz w:val="19"/>
               </w:rPr>
-              <w:t>Perception</w:t>
-            </w:r>
-          </w:p>
-        </w:tc>
-        <w:tc>
-          <w:tcPr>
-            <w:tcW w:type="dxa" w:w="5417"/>
+              <w:t>Orientation</w:t>
+            </w:r>
+          </w:p>
+        </w:tc>
+        <w:tc>
+          <w:tcPr>
+            <w:tcW w:type="dxa" w:w="5428"/>
           </w:tcPr>
           <w:p>
             <w:pPr>
@@ -10188,13 +12836,13 @@
               <w:rPr>
                 <w:sz w:val="19"/>
               </w:rPr>
-              <w:t>Taking in what the senses deliver, for example what the eyes see on a screen, before thinking about it.</w:t>
-            </w:r>
-          </w:p>
-        </w:tc>
-        <w:tc>
-          <w:tcPr>
-            <w:tcW w:type="dxa" w:w="1347"/>
+              <w:t>Knowing where you are, what you can do here and what happens next.</w:t>
+            </w:r>
+          </w:p>
+        </w:tc>
+        <w:tc>
+          <w:tcPr>
+            <w:tcW w:type="dxa" w:w="1342"/>
           </w:tcPr>
           <w:p>
             <w:pPr>
@@ -10231,7 +12879,7 @@
         </w:trPr>
         <w:tc>
           <w:tcPr>
-            <w:tcW w:type="dxa" w:w="1965"/>
+            <w:tcW w:type="dxa" w:w="1959"/>
           </w:tcPr>
           <w:p>
             <w:pPr>
@@ -10242,13 +12890,13 @@
                 <w:b/>
                 <w:sz w:val="19"/>
               </w:rPr>
-              <w:t>Primary action</w:t>
-            </w:r>
-          </w:p>
-        </w:tc>
-        <w:tc>
-          <w:tcPr>
-            <w:tcW w:type="dxa" w:w="5417"/>
+              <w:t>Perception</w:t>
+            </w:r>
+          </w:p>
+        </w:tc>
+        <w:tc>
+          <w:tcPr>
+            <w:tcW w:type="dxa" w:w="5428"/>
           </w:tcPr>
           <w:p>
             <w:pPr>
@@ -10258,13 +12906,13 @@
               <w:rPr>
                 <w:sz w:val="19"/>
               </w:rPr>
-              <w:t>The one thing most people on a screen came to do, such as “Report damage”. It should be the easiest thing to see and press.</w:t>
-            </w:r>
-          </w:p>
-        </w:tc>
-        <w:tc>
-          <w:tcPr>
-            <w:tcW w:type="dxa" w:w="1347"/>
+              <w:t>Taking in what the senses deliver, for example what the eyes see on a screen, before thinking about it.</w:t>
+            </w:r>
+          </w:p>
+        </w:tc>
+        <w:tc>
+          <w:tcPr>
+            <w:tcW w:type="dxa" w:w="1342"/>
           </w:tcPr>
           <w:p>
             <w:pPr>
@@ -10301,7 +12949,7 @@
         </w:trPr>
         <w:tc>
           <w:tcPr>
-            <w:tcW w:type="dxa" w:w="1965"/>
+            <w:tcW w:type="dxa" w:w="1959"/>
           </w:tcPr>
           <w:p>
             <w:pPr>
@@ -10312,13 +12960,13 @@
                 <w:b/>
                 <w:sz w:val="19"/>
               </w:rPr>
-              <w:t>Readability</w:t>
-            </w:r>
-          </w:p>
-        </w:tc>
-        <w:tc>
-          <w:tcPr>
-            <w:tcW w:type="dxa" w:w="5417"/>
+              <w:t>Primary action</w:t>
+            </w:r>
+          </w:p>
+        </w:tc>
+        <w:tc>
+          <w:tcPr>
+            <w:tcW w:type="dxa" w:w="5428"/>
           </w:tcPr>
           <w:p>
             <w:pPr>
@@ -10328,13 +12976,13 @@
               <w:rPr>
                 <w:sz w:val="19"/>
               </w:rPr>
-              <w:t>How easily a text can be read and understood: its size, contrast, line length, wording and how it is broken into parts.</w:t>
-            </w:r>
-          </w:p>
-        </w:tc>
-        <w:tc>
-          <w:tcPr>
-            <w:tcW w:type="dxa" w:w="1347"/>
+              <w:t>The one thing most people on a screen came to do, such as “Report damage”. It should be the easiest thing to see and press.</w:t>
+            </w:r>
+          </w:p>
+        </w:tc>
+        <w:tc>
+          <w:tcPr>
+            <w:tcW w:type="dxa" w:w="1342"/>
           </w:tcPr>
           <w:p>
             <w:pPr>
@@ -10360,7 +13008,7 @@
               <w:rPr>
                 <w:sz w:val="19"/>
               </w:rPr>
-              <w:t>Day 2</w:t>
+              <w:t>Day 1</w:t>
             </w:r>
           </w:p>
         </w:tc>
@@ -10371,7 +13019,7 @@
         </w:trPr>
         <w:tc>
           <w:tcPr>
-            <w:tcW w:type="dxa" w:w="1965"/>
+            <w:tcW w:type="dxa" w:w="1959"/>
           </w:tcPr>
           <w:p>
             <w:pPr>
@@ -10382,13 +13030,13 @@
                 <w:b/>
                 <w:sz w:val="19"/>
               </w:rPr>
-              <w:t>Scanning</w:t>
-            </w:r>
-          </w:p>
-        </w:tc>
-        <w:tc>
-          <w:tcPr>
-            <w:tcW w:type="dxa" w:w="5417"/>
+              <w:t>Readability</w:t>
+            </w:r>
+          </w:p>
+        </w:tc>
+        <w:tc>
+          <w:tcPr>
+            <w:tcW w:type="dxa" w:w="5428"/>
           </w:tcPr>
           <w:p>
             <w:pPr>
@@ -10398,13 +13046,13 @@
               <w:rPr>
                 <w:sz w:val="19"/>
               </w:rPr>
-              <w:t>Looking over a screen quickly and picking out what seems relevant, instead of reading it word by word. Most people scan first.</w:t>
-            </w:r>
-          </w:p>
-        </w:tc>
-        <w:tc>
-          <w:tcPr>
-            <w:tcW w:type="dxa" w:w="1347"/>
+              <w:t>How easily a text can be read and understood: its size, contrast, line length, wording and how it is broken into parts.</w:t>
+            </w:r>
+          </w:p>
+        </w:tc>
+        <w:tc>
+          <w:tcPr>
+            <w:tcW w:type="dxa" w:w="1342"/>
           </w:tcPr>
           <w:p>
             <w:pPr>
@@ -10441,7 +13089,7 @@
         </w:trPr>
         <w:tc>
           <w:tcPr>
-            <w:tcW w:type="dxa" w:w="1965"/>
+            <w:tcW w:type="dxa" w:w="1959"/>
           </w:tcPr>
           <w:p>
             <w:pPr>
@@ -10452,13 +13100,13 @@
                 <w:b/>
                 <w:sz w:val="19"/>
               </w:rPr>
-              <w:t>Status colour</w:t>
-            </w:r>
-          </w:p>
-        </w:tc>
-        <w:tc>
-          <w:tcPr>
-            <w:tcW w:type="dxa" w:w="5417"/>
+              <w:t>Scanning</w:t>
+            </w:r>
+          </w:p>
+        </w:tc>
+        <w:tc>
+          <w:tcPr>
+            <w:tcW w:type="dxa" w:w="5428"/>
           </w:tcPr>
           <w:p>
             <w:pPr>
@@ -10468,13 +13116,13 @@
               <w:rPr>
                 <w:sz w:val="19"/>
               </w:rPr>
-              <w:t>A colour that shows the state of something, such as sent, waiting or failed. It needs a word or a symbol next to it, because colour alone is missed or misread.</w:t>
-            </w:r>
-          </w:p>
-        </w:tc>
-        <w:tc>
-          <w:tcPr>
-            <w:tcW w:type="dxa" w:w="1347"/>
+              <w:t>Looking over a screen quickly and picking out what seems relevant, instead of reading it word by word. Most people scan first.</w:t>
+            </w:r>
+          </w:p>
+        </w:tc>
+        <w:tc>
+          <w:tcPr>
+            <w:tcW w:type="dxa" w:w="1342"/>
           </w:tcPr>
           <w:p>
             <w:pPr>
@@ -10500,7 +13148,7 @@
               <w:rPr>
                 <w:sz w:val="19"/>
               </w:rPr>
-              <w:t>Day 3</w:t>
+              <w:t>Day 2</w:t>
             </w:r>
           </w:p>
         </w:tc>
@@ -10511,7 +13159,7 @@
         </w:trPr>
         <w:tc>
           <w:tcPr>
-            <w:tcW w:type="dxa" w:w="1965"/>
+            <w:tcW w:type="dxa" w:w="1959"/>
           </w:tcPr>
           <w:p>
             <w:pPr>
@@ -10522,13 +13170,13 @@
                 <w:b/>
                 <w:sz w:val="19"/>
               </w:rPr>
-              <w:t>Touchpoint</w:t>
-            </w:r>
-          </w:p>
-        </w:tc>
-        <w:tc>
-          <w:tcPr>
-            <w:tcW w:type="dxa" w:w="5417"/>
+              <w:t>Status colour</w:t>
+            </w:r>
+          </w:p>
+        </w:tc>
+        <w:tc>
+          <w:tcPr>
+            <w:tcW w:type="dxa" w:w="5428"/>
           </w:tcPr>
           <w:p>
             <w:pPr>
@@ -10538,13 +13186,13 @@
               <w:rPr>
                 <w:sz w:val="19"/>
               </w:rPr>
-              <w:t>Any place where a person meets the company: the website, the customer portal, the app, a chatbot or a phone call.</w:t>
-            </w:r>
-          </w:p>
-        </w:tc>
-        <w:tc>
-          <w:tcPr>
-            <w:tcW w:type="dxa" w:w="1347"/>
+              <w:t>A colour that shows the state of something, such as sent, waiting or failed. It needs a word or a symbol next to it, because colour alone is missed or misread.</w:t>
+            </w:r>
+          </w:p>
+        </w:tc>
+        <w:tc>
+          <w:tcPr>
+            <w:tcW w:type="dxa" w:w="1342"/>
           </w:tcPr>
           <w:p>
             <w:pPr>
@@ -10570,7 +13218,7 @@
               <w:rPr>
                 <w:sz w:val="19"/>
               </w:rPr>
-              <w:t>Day 1</w:t>
+              <w:t>Day 3</w:t>
             </w:r>
           </w:p>
         </w:tc>
@@ -10581,7 +13229,7 @@
         </w:trPr>
         <w:tc>
           <w:tcPr>
-            <w:tcW w:type="dxa" w:w="1965"/>
+            <w:tcW w:type="dxa" w:w="1959"/>
           </w:tcPr>
           <w:p>
             <w:pPr>
@@ -10592,13 +13240,13 @@
                 <w:b/>
                 <w:sz w:val="19"/>
               </w:rPr>
-              <w:t>Typographic hierarchy</w:t>
-            </w:r>
-          </w:p>
-        </w:tc>
-        <w:tc>
-          <w:tcPr>
-            <w:tcW w:type="dxa" w:w="5417"/>
+              <w:t>Touchpoint</w:t>
+            </w:r>
+          </w:p>
+        </w:tc>
+        <w:tc>
+          <w:tcPr>
+            <w:tcW w:type="dxa" w:w="5428"/>
           </w:tcPr>
           <w:p>
             <w:pPr>
@@ -10608,13 +13256,13 @@
               <w:rPr>
                 <w:sz w:val="19"/>
               </w:rPr>
-              <w:t>A small, fixed set of text levels, such as page heading, section heading, body text and note, that look clearly different and mean the same on every page.</w:t>
-            </w:r>
-          </w:p>
-        </w:tc>
-        <w:tc>
-          <w:tcPr>
-            <w:tcW w:type="dxa" w:w="1347"/>
+              <w:t>Any place where a person meets the company: the website, the customer portal, the app, a chatbot or a phone call.</w:t>
+            </w:r>
+          </w:p>
+        </w:tc>
+        <w:tc>
+          <w:tcPr>
+            <w:tcW w:type="dxa" w:w="1342"/>
           </w:tcPr>
           <w:p>
             <w:pPr>
@@ -10640,7 +13288,7 @@
               <w:rPr>
                 <w:sz w:val="19"/>
               </w:rPr>
-              <w:t>Day 3</w:t>
+              <w:t>Day 1</w:t>
             </w:r>
           </w:p>
         </w:tc>
@@ -10651,7 +13299,7 @@
         </w:trPr>
         <w:tc>
           <w:tcPr>
-            <w:tcW w:type="dxa" w:w="1965"/>
+            <w:tcW w:type="dxa" w:w="1959"/>
           </w:tcPr>
           <w:p>
             <w:pPr>
@@ -10662,13 +13310,13 @@
                 <w:b/>
                 <w:sz w:val="19"/>
               </w:rPr>
-              <w:t>Typography</w:t>
-            </w:r>
-          </w:p>
-        </w:tc>
-        <w:tc>
-          <w:tcPr>
-            <w:tcW w:type="dxa" w:w="5417"/>
+              <w:t>Typographic hierarchy</w:t>
+            </w:r>
+          </w:p>
+        </w:tc>
+        <w:tc>
+          <w:tcPr>
+            <w:tcW w:type="dxa" w:w="5428"/>
           </w:tcPr>
           <w:p>
             <w:pPr>
@@ -10678,13 +13326,13 @@
               <w:rPr>
                 <w:sz w:val="19"/>
               </w:rPr>
-              <w:t>How text is set: which typeface, which size, weight, line spacing and line length, and how the text is broken into levels and parts.</w:t>
-            </w:r>
-          </w:p>
-        </w:tc>
-        <w:tc>
-          <w:tcPr>
-            <w:tcW w:type="dxa" w:w="1347"/>
+              <w:t>A small, fixed set of text levels, such as page heading, section heading, body text and note, that look clearly different and mean the same on every page.</w:t>
+            </w:r>
+          </w:p>
+        </w:tc>
+        <w:tc>
+          <w:tcPr>
+            <w:tcW w:type="dxa" w:w="1342"/>
           </w:tcPr>
           <w:p>
             <w:pPr>
@@ -10721,7 +13369,7 @@
         </w:trPr>
         <w:tc>
           <w:tcPr>
-            <w:tcW w:type="dxa" w:w="1965"/>
+            <w:tcW w:type="dxa" w:w="1959"/>
           </w:tcPr>
           <w:p>
             <w:pPr>
@@ -10732,13 +13380,13 @@
                 <w:b/>
                 <w:sz w:val="19"/>
               </w:rPr>
-              <w:t>UX (user experience)</w:t>
-            </w:r>
-          </w:p>
-        </w:tc>
-        <w:tc>
-          <w:tcPr>
-            <w:tcW w:type="dxa" w:w="5417"/>
+              <w:t>Typography</w:t>
+            </w:r>
+          </w:p>
+        </w:tc>
+        <w:tc>
+          <w:tcPr>
+            <w:tcW w:type="dxa" w:w="5428"/>
           </w:tcPr>
           <w:p>
             <w:pPr>
@@ -10748,13 +13396,13 @@
               <w:rPr>
                 <w:sz w:val="19"/>
               </w:rPr>
-              <w:t>Everything a person goes through when using a product: what they notice, understand, feel and do, from the first look to the last step. The screens are only one part of it.</w:t>
-            </w:r>
-          </w:p>
-        </w:tc>
-        <w:tc>
-          <w:tcPr>
-            <w:tcW w:type="dxa" w:w="1347"/>
+              <w:t>How text is set: which typeface, which size, weight, line spacing and line length, and how the text is broken into levels and parts.</w:t>
+            </w:r>
+          </w:p>
+        </w:tc>
+        <w:tc>
+          <w:tcPr>
+            <w:tcW w:type="dxa" w:w="1342"/>
           </w:tcPr>
           <w:p>
             <w:pPr>
@@ -10764,7 +13412,7 @@
               <w:rPr>
                 <w:sz w:val="19"/>
               </w:rPr>
-              <w:t>Finding the booking you want at once and feeling sure it went through is a good UX.</w:t>
+              <w:t>—</w:t>
             </w:r>
           </w:p>
         </w:tc>
@@ -10780,7 +13428,7 @@
               <w:rPr>
                 <w:sz w:val="19"/>
               </w:rPr>
-              <w:t>Day 1</w:t>
+              <w:t>Day 3</w:t>
             </w:r>
           </w:p>
         </w:tc>
@@ -10791,7 +13439,7 @@
         </w:trPr>
         <w:tc>
           <w:tcPr>
-            <w:tcW w:type="dxa" w:w="1965"/>
+            <w:tcW w:type="dxa" w:w="1959"/>
           </w:tcPr>
           <w:p>
             <w:pPr>
@@ -10802,13 +13450,83 @@
                 <w:b/>
                 <w:sz w:val="19"/>
               </w:rPr>
+              <w:t>UX (user experience)</w:t>
+            </w:r>
+          </w:p>
+        </w:tc>
+        <w:tc>
+          <w:tcPr>
+            <w:tcW w:type="dxa" w:w="5428"/>
+          </w:tcPr>
+          <w:p>
+            <w:pPr>
+              <w:spacing w:before="0" w:after="0"/>
+            </w:pPr>
+            <w:r>
+              <w:rPr>
+                <w:sz w:val="19"/>
+              </w:rPr>
+              <w:t>Everything a person goes through when using a product: what they notice, understand, feel and do, from the first look to the last step. The screens are only one part of it.</w:t>
+            </w:r>
+          </w:p>
+        </w:tc>
+        <w:tc>
+          <w:tcPr>
+            <w:tcW w:type="dxa" w:w="1342"/>
+          </w:tcPr>
+          <w:p>
+            <w:pPr>
+              <w:spacing w:before="0" w:after="0"/>
+            </w:pPr>
+            <w:r>
+              <w:rPr>
+                <w:sz w:val="19"/>
+              </w:rPr>
+              <w:t>Finding the booking you want at once and feeling sure it went through is a good UX.</w:t>
+            </w:r>
+          </w:p>
+        </w:tc>
+        <w:tc>
+          <w:tcPr>
+            <w:tcW w:type="dxa" w:w="909"/>
+          </w:tcPr>
+          <w:p>
+            <w:pPr>
+              <w:spacing w:before="0" w:after="0"/>
+            </w:pPr>
+            <w:r>
+              <w:rPr>
+                <w:sz w:val="19"/>
+              </w:rPr>
+              <w:t>Day 1</w:t>
+            </w:r>
+          </w:p>
+        </w:tc>
+      </w:tr>
+      <w:tr>
+        <w:trPr>
+          <w:cantSplit/>
+        </w:trPr>
+        <w:tc>
+          <w:tcPr>
+            <w:tcW w:type="dxa" w:w="1959"/>
+          </w:tcPr>
+          <w:p>
+            <w:pPr>
+              <w:spacing w:before="0" w:after="0"/>
+            </w:pPr>
+            <w:r>
+              <w:rPr>
+                <w:b/>
+                <w:sz w:val="19"/>
+              </w:rPr>
               <w:t>Visual hierarchy</w:t>
             </w:r>
           </w:p>
         </w:tc>
         <w:tc>
           <w:tcPr>
-            <w:tcW w:type="dxa" w:w="5417"/>
+            <w:tcW w:type="dxa" w:w="5428"/>
           </w:tcPr>
           <w:p>
             <w:pPr>
@@ -10824,7 +13542,7 @@
         </w:tc>
         <w:tc>
           <w:tcPr>
-            <w:tcW w:type="dxa" w:w="1347"/>
+            <w:tcW w:type="dxa" w:w="1342"/>
           </w:tcPr>
           <w:p>
             <w:pPr>

</xml_diff>